<commit_message>
Lecture 5 Heading only
</commit_message>
<xml_diff>
--- a/React JS.docx
+++ b/React JS.docx
@@ -81,7 +81,7 @@
           <w:r>
             <w:fldChar w:fldCharType="separate"/>
           </w:r>
-          <w:hyperlink w:anchor="_Toc235525331" w:history="1">
+          <w:hyperlink w:anchor="_Toc235529151" w:history="1">
             <w:r>
               <w:rPr>
                 <w:rStyle w:val="Hyperlink"/>
@@ -110,7 +110,7 @@
                 <w:noProof/>
                 <w:webHidden/>
               </w:rPr>
-              <w:instrText xml:space="preserve"> PAGEREF _Toc235525331 \h </w:instrText>
+              <w:instrText xml:space="preserve"> PAGEREF _Toc235529151 \h </w:instrText>
             </w:r>
             <w:r>
               <w:rPr>
@@ -153,7 +153,7 @@
               <w:lang w:eastAsia="en-IN"/>
             </w:rPr>
           </w:pPr>
-          <w:hyperlink w:anchor="_Toc235525332" w:history="1">
+          <w:hyperlink w:anchor="_Toc235529152" w:history="1">
             <w:r>
               <w:rPr>
                 <w:rStyle w:val="Hyperlink"/>
@@ -180,7 +180,7 @@
                 <w:noProof/>
                 <w:webHidden/>
               </w:rPr>
-              <w:instrText xml:space="preserve"> PAGEREF _Toc235525332 \h </w:instrText>
+              <w:instrText xml:space="preserve"> PAGEREF _Toc235529152 \h </w:instrText>
             </w:r>
             <w:r>
               <w:rPr>
@@ -223,7 +223,7 @@
               <w:lang w:eastAsia="en-IN"/>
             </w:rPr>
           </w:pPr>
-          <w:hyperlink w:anchor="_Toc235525333" w:history="1">
+          <w:hyperlink w:anchor="_Toc235529153" w:history="1">
             <w:r>
               <w:rPr>
                 <w:rStyle w:val="Hyperlink"/>
@@ -250,7 +250,7 @@
                 <w:noProof/>
                 <w:webHidden/>
               </w:rPr>
-              <w:instrText xml:space="preserve"> PAGEREF _Toc235525333 \h </w:instrText>
+              <w:instrText xml:space="preserve"> PAGEREF _Toc235529153 \h </w:instrText>
             </w:r>
             <w:r>
               <w:rPr>
@@ -293,7 +293,7 @@
               <w:lang w:eastAsia="en-IN"/>
             </w:rPr>
           </w:pPr>
-          <w:hyperlink w:anchor="_Toc235525334" w:history="1">
+          <w:hyperlink w:anchor="_Toc235529154" w:history="1">
             <w:r>
               <w:rPr>
                 <w:rStyle w:val="Hyperlink"/>
@@ -320,7 +320,7 @@
                 <w:noProof/>
                 <w:webHidden/>
               </w:rPr>
-              <w:instrText xml:space="preserve"> PAGEREF _Toc235525334 \h </w:instrText>
+              <w:instrText xml:space="preserve"> PAGEREF _Toc235529154 \h </w:instrText>
             </w:r>
             <w:r>
               <w:rPr>
@@ -363,7 +363,7 @@
               <w:lang w:eastAsia="en-IN"/>
             </w:rPr>
           </w:pPr>
-          <w:hyperlink w:anchor="_Toc235525335" w:history="1">
+          <w:hyperlink w:anchor="_Toc235529155" w:history="1">
             <w:r>
               <w:rPr>
                 <w:rStyle w:val="Hyperlink"/>
@@ -390,7 +390,7 @@
                 <w:noProof/>
                 <w:webHidden/>
               </w:rPr>
-              <w:instrText xml:space="preserve"> PAGEREF _Toc235525335 \h </w:instrText>
+              <w:instrText xml:space="preserve"> PAGEREF _Toc235529155 \h </w:instrText>
             </w:r>
             <w:r>
               <w:rPr>
@@ -433,7 +433,7 @@
               <w:lang w:eastAsia="en-IN"/>
             </w:rPr>
           </w:pPr>
-          <w:hyperlink w:anchor="_Toc235525336" w:history="1">
+          <w:hyperlink w:anchor="_Toc235529156" w:history="1">
             <w:r>
               <w:rPr>
                 <w:rStyle w:val="Hyperlink"/>
@@ -460,7 +460,7 @@
                 <w:noProof/>
                 <w:webHidden/>
               </w:rPr>
-              <w:instrText xml:space="preserve"> PAGEREF _Toc235525336 \h </w:instrText>
+              <w:instrText xml:space="preserve"> PAGEREF _Toc235529156 \h </w:instrText>
             </w:r>
             <w:r>
               <w:rPr>
@@ -503,7 +503,7 @@
               <w:lang w:eastAsia="en-IN"/>
             </w:rPr>
           </w:pPr>
-          <w:hyperlink w:anchor="_Toc235525337" w:history="1">
+          <w:hyperlink w:anchor="_Toc235529157" w:history="1">
             <w:r>
               <w:rPr>
                 <w:rStyle w:val="Hyperlink"/>
@@ -530,7 +530,7 @@
                 <w:noProof/>
                 <w:webHidden/>
               </w:rPr>
-              <w:instrText xml:space="preserve"> PAGEREF _Toc235525337 \h </w:instrText>
+              <w:instrText xml:space="preserve"> PAGEREF _Toc235529157 \h </w:instrText>
             </w:r>
             <w:r>
               <w:rPr>
@@ -573,7 +573,7 @@
               <w:lang w:eastAsia="en-IN"/>
             </w:rPr>
           </w:pPr>
-          <w:hyperlink w:anchor="_Toc235525338" w:history="1">
+          <w:hyperlink w:anchor="_Toc235529158" w:history="1">
             <w:r>
               <w:rPr>
                 <w:rStyle w:val="Hyperlink"/>
@@ -600,7 +600,7 @@
                 <w:noProof/>
                 <w:webHidden/>
               </w:rPr>
-              <w:instrText xml:space="preserve"> PAGEREF _Toc235525338 \h </w:instrText>
+              <w:instrText xml:space="preserve"> PAGEREF _Toc235529158 \h </w:instrText>
             </w:r>
             <w:r>
               <w:rPr>
@@ -643,7 +643,7 @@
               <w:lang w:eastAsia="en-IN"/>
             </w:rPr>
           </w:pPr>
-          <w:hyperlink w:anchor="_Toc235525339" w:history="1">
+          <w:hyperlink w:anchor="_Toc235529159" w:history="1">
             <w:r>
               <w:rPr>
                 <w:rStyle w:val="Hyperlink"/>
@@ -670,7 +670,7 @@
                 <w:noProof/>
                 <w:webHidden/>
               </w:rPr>
-              <w:instrText xml:space="preserve"> PAGEREF _Toc235525339 \h </w:instrText>
+              <w:instrText xml:space="preserve"> PAGEREF _Toc235529159 \h </w:instrText>
             </w:r>
             <w:r>
               <w:rPr>
@@ -713,7 +713,7 @@
               <w:lang w:eastAsia="en-IN"/>
             </w:rPr>
           </w:pPr>
-          <w:hyperlink w:anchor="_Toc235525340" w:history="1">
+          <w:hyperlink w:anchor="_Toc235529160" w:history="1">
             <w:r>
               <w:rPr>
                 <w:rStyle w:val="Hyperlink"/>
@@ -742,7 +742,7 @@
                 <w:noProof/>
                 <w:webHidden/>
               </w:rPr>
-              <w:instrText xml:space="preserve"> PAGEREF _Toc235525340 \h </w:instrText>
+              <w:instrText xml:space="preserve"> PAGEREF _Toc235529160 \h </w:instrText>
             </w:r>
             <w:r>
               <w:rPr>
@@ -785,7 +785,7 @@
               <w:lang w:eastAsia="en-IN"/>
             </w:rPr>
           </w:pPr>
-          <w:hyperlink w:anchor="_Toc235525341" w:history="1">
+          <w:hyperlink w:anchor="_Toc235529161" w:history="1">
             <w:r>
               <w:rPr>
                 <w:rStyle w:val="Hyperlink"/>
@@ -812,7 +812,7 @@
                 <w:noProof/>
                 <w:webHidden/>
               </w:rPr>
-              <w:instrText xml:space="preserve"> PAGEREF _Toc235525341 \h </w:instrText>
+              <w:instrText xml:space="preserve"> PAGEREF _Toc235529161 \h </w:instrText>
             </w:r>
             <w:r>
               <w:rPr>
@@ -855,7 +855,7 @@
               <w:lang w:eastAsia="en-IN"/>
             </w:rPr>
           </w:pPr>
-          <w:hyperlink w:anchor="_Toc235525342" w:history="1">
+          <w:hyperlink w:anchor="_Toc235529162" w:history="1">
             <w:r>
               <w:rPr>
                 <w:rStyle w:val="Hyperlink"/>
@@ -882,7 +882,7 @@
                 <w:noProof/>
                 <w:webHidden/>
               </w:rPr>
-              <w:instrText xml:space="preserve"> PAGEREF _Toc235525342 \h </w:instrText>
+              <w:instrText xml:space="preserve"> PAGEREF _Toc235529162 \h </w:instrText>
             </w:r>
             <w:r>
               <w:rPr>
@@ -925,7 +925,7 @@
               <w:lang w:eastAsia="en-IN"/>
             </w:rPr>
           </w:pPr>
-          <w:hyperlink w:anchor="_Toc235525343" w:history="1">
+          <w:hyperlink w:anchor="_Toc235529163" w:history="1">
             <w:r>
               <w:rPr>
                 <w:rStyle w:val="Hyperlink"/>
@@ -952,7 +952,7 @@
                 <w:noProof/>
                 <w:webHidden/>
               </w:rPr>
-              <w:instrText xml:space="preserve"> PAGEREF _Toc235525343 \h </w:instrText>
+              <w:instrText xml:space="preserve"> PAGEREF _Toc235529163 \h </w:instrText>
             </w:r>
             <w:r>
               <w:rPr>
@@ -995,7 +995,7 @@
               <w:lang w:eastAsia="en-IN"/>
             </w:rPr>
           </w:pPr>
-          <w:hyperlink w:anchor="_Toc235525344" w:history="1">
+          <w:hyperlink w:anchor="_Toc235529164" w:history="1">
             <w:r>
               <w:rPr>
                 <w:rStyle w:val="Hyperlink"/>
@@ -1022,7 +1022,7 @@
                 <w:noProof/>
                 <w:webHidden/>
               </w:rPr>
-              <w:instrText xml:space="preserve"> PAGEREF _Toc235525344 \h </w:instrText>
+              <w:instrText xml:space="preserve"> PAGEREF _Toc235529164 \h </w:instrText>
             </w:r>
             <w:r>
               <w:rPr>
@@ -1065,7 +1065,7 @@
               <w:lang w:eastAsia="en-IN"/>
             </w:rPr>
           </w:pPr>
-          <w:hyperlink w:anchor="_Toc235525345" w:history="1">
+          <w:hyperlink w:anchor="_Toc235529165" w:history="1">
             <w:r>
               <w:rPr>
                 <w:rStyle w:val="Hyperlink"/>
@@ -1092,7 +1092,7 @@
                 <w:noProof/>
                 <w:webHidden/>
               </w:rPr>
-              <w:instrText xml:space="preserve"> PAGEREF _Toc235525345 \h </w:instrText>
+              <w:instrText xml:space="preserve"> PAGEREF _Toc235529165 \h </w:instrText>
             </w:r>
             <w:r>
               <w:rPr>
@@ -1135,7 +1135,7 @@
               <w:lang w:eastAsia="en-IN"/>
             </w:rPr>
           </w:pPr>
-          <w:hyperlink w:anchor="_Toc235525346" w:history="1">
+          <w:hyperlink w:anchor="_Toc235529166" w:history="1">
             <w:r>
               <w:rPr>
                 <w:rStyle w:val="Hyperlink"/>
@@ -1162,7 +1162,7 @@
                 <w:noProof/>
                 <w:webHidden/>
               </w:rPr>
-              <w:instrText xml:space="preserve"> PAGEREF _Toc235525346 \h </w:instrText>
+              <w:instrText xml:space="preserve"> PAGEREF _Toc235529166 \h </w:instrText>
             </w:r>
             <w:r>
               <w:rPr>
@@ -1205,7 +1205,7 @@
               <w:lang w:eastAsia="en-IN"/>
             </w:rPr>
           </w:pPr>
-          <w:hyperlink w:anchor="_Toc235525347" w:history="1">
+          <w:hyperlink w:anchor="_Toc235529167" w:history="1">
             <w:r>
               <w:rPr>
                 <w:rStyle w:val="Hyperlink"/>
@@ -1232,7 +1232,7 @@
                 <w:noProof/>
                 <w:webHidden/>
               </w:rPr>
-              <w:instrText xml:space="preserve"> PAGEREF _Toc235525347 \h </w:instrText>
+              <w:instrText xml:space="preserve"> PAGEREF _Toc235529167 \h </w:instrText>
             </w:r>
             <w:r>
               <w:rPr>
@@ -1275,7 +1275,7 @@
               <w:lang w:eastAsia="en-IN"/>
             </w:rPr>
           </w:pPr>
-          <w:hyperlink w:anchor="_Toc235525348" w:history="1">
+          <w:hyperlink w:anchor="_Toc235529168" w:history="1">
             <w:r>
               <w:rPr>
                 <w:rStyle w:val="Hyperlink"/>
@@ -1302,7 +1302,7 @@
                 <w:noProof/>
                 <w:webHidden/>
               </w:rPr>
-              <w:instrText xml:space="preserve"> PAGEREF _Toc235525348 \h </w:instrText>
+              <w:instrText xml:space="preserve"> PAGEREF _Toc235529168 \h </w:instrText>
             </w:r>
             <w:r>
               <w:rPr>
@@ -1345,7 +1345,7 @@
               <w:lang w:eastAsia="en-IN"/>
             </w:rPr>
           </w:pPr>
-          <w:hyperlink w:anchor="_Toc235525349" w:history="1">
+          <w:hyperlink w:anchor="_Toc235529169" w:history="1">
             <w:r>
               <w:rPr>
                 <w:rStyle w:val="Hyperlink"/>
@@ -1372,7 +1372,7 @@
                 <w:noProof/>
                 <w:webHidden/>
               </w:rPr>
-              <w:instrText xml:space="preserve"> PAGEREF _Toc235525349 \h </w:instrText>
+              <w:instrText xml:space="preserve"> PAGEREF _Toc235529169 \h </w:instrText>
             </w:r>
             <w:r>
               <w:rPr>
@@ -1415,7 +1415,7 @@
               <w:lang w:eastAsia="en-IN"/>
             </w:rPr>
           </w:pPr>
-          <w:hyperlink w:anchor="_Toc235525350" w:history="1">
+          <w:hyperlink w:anchor="_Toc235529170" w:history="1">
             <w:r>
               <w:rPr>
                 <w:rStyle w:val="Hyperlink"/>
@@ -1444,7 +1444,7 @@
                 <w:noProof/>
                 <w:webHidden/>
               </w:rPr>
-              <w:instrText xml:space="preserve"> PAGEREF _Toc235525350 \h </w:instrText>
+              <w:instrText xml:space="preserve"> PAGEREF _Toc235529170 \h </w:instrText>
             </w:r>
             <w:r>
               <w:rPr>
@@ -1487,7 +1487,7 @@
               <w:lang w:eastAsia="en-IN"/>
             </w:rPr>
           </w:pPr>
-          <w:hyperlink w:anchor="_Toc235525351" w:history="1">
+          <w:hyperlink w:anchor="_Toc235529171" w:history="1">
             <w:r>
               <w:rPr>
                 <w:rStyle w:val="Hyperlink"/>
@@ -1514,7 +1514,7 @@
                 <w:noProof/>
                 <w:webHidden/>
               </w:rPr>
-              <w:instrText xml:space="preserve"> PAGEREF _Toc235525351 \h </w:instrText>
+              <w:instrText xml:space="preserve"> PAGEREF _Toc235529171 \h </w:instrText>
             </w:r>
             <w:r>
               <w:rPr>
@@ -1557,7 +1557,7 @@
               <w:lang w:eastAsia="en-IN"/>
             </w:rPr>
           </w:pPr>
-          <w:hyperlink w:anchor="_Toc235525352" w:history="1">
+          <w:hyperlink w:anchor="_Toc235529172" w:history="1">
             <w:r>
               <w:rPr>
                 <w:rStyle w:val="Hyperlink"/>
@@ -1584,7 +1584,7 @@
                 <w:noProof/>
                 <w:webHidden/>
               </w:rPr>
-              <w:instrText xml:space="preserve"> PAGEREF _Toc235525352 \h </w:instrText>
+              <w:instrText xml:space="preserve"> PAGEREF _Toc235529172 \h </w:instrText>
             </w:r>
             <w:r>
               <w:rPr>
@@ -1627,7 +1627,7 @@
               <w:lang w:eastAsia="en-IN"/>
             </w:rPr>
           </w:pPr>
-          <w:hyperlink w:anchor="_Toc235525353" w:history="1">
+          <w:hyperlink w:anchor="_Toc235529173" w:history="1">
             <w:r>
               <w:rPr>
                 <w:rStyle w:val="Hyperlink"/>
@@ -1654,7 +1654,7 @@
                 <w:noProof/>
                 <w:webHidden/>
               </w:rPr>
-              <w:instrText xml:space="preserve"> PAGEREF _Toc235525353 \h </w:instrText>
+              <w:instrText xml:space="preserve"> PAGEREF _Toc235529173 \h </w:instrText>
             </w:r>
             <w:r>
               <w:rPr>
@@ -1697,7 +1697,7 @@
               <w:lang w:eastAsia="en-IN"/>
             </w:rPr>
           </w:pPr>
-          <w:hyperlink w:anchor="_Toc235525354" w:history="1">
+          <w:hyperlink w:anchor="_Toc235529174" w:history="1">
             <w:r>
               <w:rPr>
                 <w:rStyle w:val="Hyperlink"/>
@@ -1724,7 +1724,7 @@
                 <w:noProof/>
                 <w:webHidden/>
               </w:rPr>
-              <w:instrText xml:space="preserve"> PAGEREF _Toc235525354 \h </w:instrText>
+              <w:instrText xml:space="preserve"> PAGEREF _Toc235529174 \h </w:instrText>
             </w:r>
             <w:r>
               <w:rPr>
@@ -1767,7 +1767,7 @@
               <w:lang w:eastAsia="en-IN"/>
             </w:rPr>
           </w:pPr>
-          <w:hyperlink w:anchor="_Toc235525355" w:history="1">
+          <w:hyperlink w:anchor="_Toc235529175" w:history="1">
             <w:r>
               <w:rPr>
                 <w:rStyle w:val="Hyperlink"/>
@@ -1794,7 +1794,7 @@
                 <w:noProof/>
                 <w:webHidden/>
               </w:rPr>
-              <w:instrText xml:space="preserve"> PAGEREF _Toc235525355 \h </w:instrText>
+              <w:instrText xml:space="preserve"> PAGEREF _Toc235529175 \h </w:instrText>
             </w:r>
             <w:r>
               <w:rPr>
@@ -1837,7 +1837,7 @@
               <w:lang w:eastAsia="en-IN"/>
             </w:rPr>
           </w:pPr>
-          <w:hyperlink w:anchor="_Toc235525356" w:history="1">
+          <w:hyperlink w:anchor="_Toc235529176" w:history="1">
             <w:r>
               <w:rPr>
                 <w:rStyle w:val="Hyperlink"/>
@@ -1864,7 +1864,7 @@
                 <w:noProof/>
                 <w:webHidden/>
               </w:rPr>
-              <w:instrText xml:space="preserve"> PAGEREF _Toc235525356 \h </w:instrText>
+              <w:instrText xml:space="preserve"> PAGEREF _Toc235529176 \h </w:instrText>
             </w:r>
             <w:r>
               <w:rPr>
@@ -1907,7 +1907,7 @@
               <w:lang w:eastAsia="en-IN"/>
             </w:rPr>
           </w:pPr>
-          <w:hyperlink w:anchor="_Toc235525357" w:history="1">
+          <w:hyperlink w:anchor="_Toc235529177" w:history="1">
             <w:r>
               <w:rPr>
                 <w:rStyle w:val="Hyperlink"/>
@@ -1915,43 +1915,7 @@
                 <w:bCs/>
                 <w:noProof/>
               </w:rPr>
-              <w:t>Chapter 4 – S</w:t>
-            </w:r>
-            <w:r>
-              <w:rPr>
-                <w:rStyle w:val="Hyperlink"/>
-                <w:b/>
-                <w:bCs/>
-                <w:noProof/>
-              </w:rPr>
-              <w:t>e</w:t>
-            </w:r>
-            <w:r>
-              <w:rPr>
-                <w:rStyle w:val="Hyperlink"/>
-                <w:b/>
-                <w:bCs/>
-                <w:noProof/>
-              </w:rPr>
-              <w:t xml:space="preserve">tting </w:t>
-            </w:r>
-            <w:r>
-              <w:rPr>
-                <w:rStyle w:val="Hyperlink"/>
-                <w:b/>
-                <w:bCs/>
-                <w:noProof/>
-              </w:rPr>
-              <w:t>U</w:t>
-            </w:r>
-            <w:r>
-              <w:rPr>
-                <w:rStyle w:val="Hyperlink"/>
-                <w:b/>
-                <w:bCs/>
-                <w:noProof/>
-              </w:rPr>
-              <w:t>p React with Vite</w:t>
+              <w:t>Chapter 4 – Setting Up React with Vite</w:t>
             </w:r>
             <w:r>
               <w:rPr>
@@ -1972,7 +1936,7 @@
                 <w:noProof/>
                 <w:webHidden/>
               </w:rPr>
-              <w:instrText xml:space="preserve"> PAGEREF _Toc235525357 \h </w:instrText>
+              <w:instrText xml:space="preserve"> PAGEREF _Toc235529177 \h </w:instrText>
             </w:r>
             <w:r>
               <w:rPr>
@@ -2015,7 +1979,7 @@
               <w:lang w:eastAsia="en-IN"/>
             </w:rPr>
           </w:pPr>
-          <w:hyperlink w:anchor="_Toc235525358" w:history="1">
+          <w:hyperlink w:anchor="_Toc235529178" w:history="1">
             <w:r>
               <w:rPr>
                 <w:rStyle w:val="Hyperlink"/>
@@ -2042,7 +2006,7 @@
                 <w:noProof/>
                 <w:webHidden/>
               </w:rPr>
-              <w:instrText xml:space="preserve"> PAGEREF _Toc235525358 \h </w:instrText>
+              <w:instrText xml:space="preserve"> PAGEREF _Toc235529178 \h </w:instrText>
             </w:r>
             <w:r>
               <w:rPr>
@@ -2085,7 +2049,7 @@
               <w:lang w:eastAsia="en-IN"/>
             </w:rPr>
           </w:pPr>
-          <w:hyperlink w:anchor="_Toc235525359" w:history="1">
+          <w:hyperlink w:anchor="_Toc235529179" w:history="1">
             <w:r>
               <w:rPr>
                 <w:rStyle w:val="Hyperlink"/>
@@ -2112,7 +2076,7 @@
                 <w:noProof/>
                 <w:webHidden/>
               </w:rPr>
-              <w:instrText xml:space="preserve"> PAGEREF _Toc235525359 \h </w:instrText>
+              <w:instrText xml:space="preserve"> PAGEREF _Toc235529179 \h </w:instrText>
             </w:r>
             <w:r>
               <w:rPr>
@@ -2155,7 +2119,7 @@
               <w:lang w:eastAsia="en-IN"/>
             </w:rPr>
           </w:pPr>
-          <w:hyperlink w:anchor="_Toc235525360" w:history="1">
+          <w:hyperlink w:anchor="_Toc235529180" w:history="1">
             <w:r>
               <w:rPr>
                 <w:rStyle w:val="Hyperlink"/>
@@ -2182,7 +2146,7 @@
                 <w:noProof/>
                 <w:webHidden/>
               </w:rPr>
-              <w:instrText xml:space="preserve"> PAGEREF _Toc235525360 \h </w:instrText>
+              <w:instrText xml:space="preserve"> PAGEREF _Toc235529180 \h </w:instrText>
             </w:r>
             <w:r>
               <w:rPr>
@@ -2203,6 +2167,597 @@
                 <w:webHidden/>
               </w:rPr>
               <w:t>27</w:t>
+            </w:r>
+            <w:r>
+              <w:rPr>
+                <w:noProof/>
+                <w:webHidden/>
+              </w:rPr>
+              <w:fldChar w:fldCharType="end"/>
+            </w:r>
+          </w:hyperlink>
+        </w:p>
+        <w:p>
+          <w:pPr>
+            <w:pStyle w:val="TOC2"/>
+            <w:tabs>
+              <w:tab w:val="right" w:leader="dot" w:pos="9016"/>
+            </w:tabs>
+            <w:rPr>
+              <w:rFonts w:eastAsiaTheme="minorEastAsia"/>
+              <w:noProof/>
+              <w:lang w:eastAsia="en-IN"/>
+            </w:rPr>
+          </w:pPr>
+          <w:hyperlink w:anchor="_Toc235529181" w:history="1">
+            <w:r>
+              <w:rPr>
+                <w:rStyle w:val="Hyperlink"/>
+                <w:noProof/>
+              </w:rPr>
+              <w:t>Folder Structure Overview (What Vite Generates)</w:t>
+            </w:r>
+            <w:r>
+              <w:rPr>
+                <w:noProof/>
+                <w:webHidden/>
+              </w:rPr>
+              <w:tab/>
+            </w:r>
+            <w:r>
+              <w:rPr>
+                <w:noProof/>
+                <w:webHidden/>
+              </w:rPr>
+              <w:fldChar w:fldCharType="begin"/>
+            </w:r>
+            <w:r>
+              <w:rPr>
+                <w:noProof/>
+                <w:webHidden/>
+              </w:rPr>
+              <w:instrText xml:space="preserve"> PAGEREF _Toc235529181 \h </w:instrText>
+            </w:r>
+            <w:r>
+              <w:rPr>
+                <w:noProof/>
+                <w:webHidden/>
+              </w:rPr>
+            </w:r>
+            <w:r>
+              <w:rPr>
+                <w:noProof/>
+                <w:webHidden/>
+              </w:rPr>
+              <w:fldChar w:fldCharType="separate"/>
+            </w:r>
+            <w:r>
+              <w:rPr>
+                <w:noProof/>
+                <w:webHidden/>
+              </w:rPr>
+              <w:t>29</w:t>
+            </w:r>
+            <w:r>
+              <w:rPr>
+                <w:noProof/>
+                <w:webHidden/>
+              </w:rPr>
+              <w:fldChar w:fldCharType="end"/>
+            </w:r>
+          </w:hyperlink>
+        </w:p>
+        <w:p>
+          <w:pPr>
+            <w:pStyle w:val="TOC2"/>
+            <w:tabs>
+              <w:tab w:val="right" w:leader="dot" w:pos="9016"/>
+            </w:tabs>
+            <w:rPr>
+              <w:rFonts w:eastAsiaTheme="minorEastAsia"/>
+              <w:noProof/>
+              <w:lang w:eastAsia="en-IN"/>
+            </w:rPr>
+          </w:pPr>
+          <w:hyperlink w:anchor="_Toc235529182" w:history="1">
+            <w:r>
+              <w:rPr>
+                <w:rStyle w:val="Hyperlink"/>
+                <w:noProof/>
+              </w:rPr>
+              <w:t xml:space="preserve">Understanding </w:t>
+            </w:r>
+            <w:r>
+              <w:rPr>
+                <w:rStyle w:val="Hyperlink"/>
+                <w:b/>
+                <w:bCs/>
+                <w:i/>
+                <w:iCs/>
+                <w:noProof/>
+              </w:rPr>
+              <w:t>App.jsx</w:t>
+            </w:r>
+            <w:r>
+              <w:rPr>
+                <w:rStyle w:val="Hyperlink"/>
+                <w:noProof/>
+              </w:rPr>
+              <w:t xml:space="preserve"> and </w:t>
+            </w:r>
+            <w:r>
+              <w:rPr>
+                <w:rStyle w:val="Hyperlink"/>
+                <w:b/>
+                <w:bCs/>
+                <w:i/>
+                <w:iCs/>
+                <w:noProof/>
+              </w:rPr>
+              <w:t>main.jsx</w:t>
+            </w:r>
+            <w:r>
+              <w:rPr>
+                <w:noProof/>
+                <w:webHidden/>
+              </w:rPr>
+              <w:tab/>
+            </w:r>
+            <w:r>
+              <w:rPr>
+                <w:noProof/>
+                <w:webHidden/>
+              </w:rPr>
+              <w:fldChar w:fldCharType="begin"/>
+            </w:r>
+            <w:r>
+              <w:rPr>
+                <w:noProof/>
+                <w:webHidden/>
+              </w:rPr>
+              <w:instrText xml:space="preserve"> PAGEREF _Toc235529182 \h </w:instrText>
+            </w:r>
+            <w:r>
+              <w:rPr>
+                <w:noProof/>
+                <w:webHidden/>
+              </w:rPr>
+            </w:r>
+            <w:r>
+              <w:rPr>
+                <w:noProof/>
+                <w:webHidden/>
+              </w:rPr>
+              <w:fldChar w:fldCharType="separate"/>
+            </w:r>
+            <w:r>
+              <w:rPr>
+                <w:noProof/>
+                <w:webHidden/>
+              </w:rPr>
+              <w:t>30</w:t>
+            </w:r>
+            <w:r>
+              <w:rPr>
+                <w:noProof/>
+                <w:webHidden/>
+              </w:rPr>
+              <w:fldChar w:fldCharType="end"/>
+            </w:r>
+          </w:hyperlink>
+        </w:p>
+        <w:p>
+          <w:pPr>
+            <w:pStyle w:val="TOC2"/>
+            <w:tabs>
+              <w:tab w:val="right" w:leader="dot" w:pos="9016"/>
+            </w:tabs>
+            <w:rPr>
+              <w:rFonts w:eastAsiaTheme="minorEastAsia"/>
+              <w:noProof/>
+              <w:lang w:eastAsia="en-IN"/>
+            </w:rPr>
+          </w:pPr>
+          <w:hyperlink w:anchor="_Toc235529183" w:history="1">
+            <w:r>
+              <w:rPr>
+                <w:rStyle w:val="Hyperlink"/>
+                <w:noProof/>
+              </w:rPr>
+              <w:t>The Rendering Chain (Hierarchy)</w:t>
+            </w:r>
+            <w:r>
+              <w:rPr>
+                <w:noProof/>
+                <w:webHidden/>
+              </w:rPr>
+              <w:tab/>
+            </w:r>
+            <w:r>
+              <w:rPr>
+                <w:noProof/>
+                <w:webHidden/>
+              </w:rPr>
+              <w:fldChar w:fldCharType="begin"/>
+            </w:r>
+            <w:r>
+              <w:rPr>
+                <w:noProof/>
+                <w:webHidden/>
+              </w:rPr>
+              <w:instrText xml:space="preserve"> PAGEREF _Toc235529183 \h </w:instrText>
+            </w:r>
+            <w:r>
+              <w:rPr>
+                <w:noProof/>
+                <w:webHidden/>
+              </w:rPr>
+            </w:r>
+            <w:r>
+              <w:rPr>
+                <w:noProof/>
+                <w:webHidden/>
+              </w:rPr>
+              <w:fldChar w:fldCharType="separate"/>
+            </w:r>
+            <w:r>
+              <w:rPr>
+                <w:noProof/>
+                <w:webHidden/>
+              </w:rPr>
+              <w:t>32</w:t>
+            </w:r>
+            <w:r>
+              <w:rPr>
+                <w:noProof/>
+                <w:webHidden/>
+              </w:rPr>
+              <w:fldChar w:fldCharType="end"/>
+            </w:r>
+          </w:hyperlink>
+        </w:p>
+        <w:p>
+          <w:pPr>
+            <w:pStyle w:val="TOC2"/>
+            <w:tabs>
+              <w:tab w:val="right" w:leader="dot" w:pos="9016"/>
+            </w:tabs>
+            <w:rPr>
+              <w:rFonts w:eastAsiaTheme="minorEastAsia"/>
+              <w:noProof/>
+              <w:lang w:eastAsia="en-IN"/>
+            </w:rPr>
+          </w:pPr>
+          <w:hyperlink w:anchor="_Toc235529184" w:history="1">
+            <w:r>
+              <w:rPr>
+                <w:rStyle w:val="Hyperlink"/>
+                <w:noProof/>
+              </w:rPr>
+              <w:t>CSS in the Project</w:t>
+            </w:r>
+            <w:r>
+              <w:rPr>
+                <w:noProof/>
+                <w:webHidden/>
+              </w:rPr>
+              <w:tab/>
+            </w:r>
+            <w:r>
+              <w:rPr>
+                <w:noProof/>
+                <w:webHidden/>
+              </w:rPr>
+              <w:fldChar w:fldCharType="begin"/>
+            </w:r>
+            <w:r>
+              <w:rPr>
+                <w:noProof/>
+                <w:webHidden/>
+              </w:rPr>
+              <w:instrText xml:space="preserve"> PAGEREF _Toc235529184 \h </w:instrText>
+            </w:r>
+            <w:r>
+              <w:rPr>
+                <w:noProof/>
+                <w:webHidden/>
+              </w:rPr>
+            </w:r>
+            <w:r>
+              <w:rPr>
+                <w:noProof/>
+                <w:webHidden/>
+              </w:rPr>
+              <w:fldChar w:fldCharType="separate"/>
+            </w:r>
+            <w:r>
+              <w:rPr>
+                <w:noProof/>
+                <w:webHidden/>
+              </w:rPr>
+              <w:t>33</w:t>
+            </w:r>
+            <w:r>
+              <w:rPr>
+                <w:noProof/>
+                <w:webHidden/>
+              </w:rPr>
+              <w:fldChar w:fldCharType="end"/>
+            </w:r>
+          </w:hyperlink>
+        </w:p>
+        <w:p>
+          <w:pPr>
+            <w:pStyle w:val="TOC2"/>
+            <w:tabs>
+              <w:tab w:val="right" w:leader="dot" w:pos="9016"/>
+            </w:tabs>
+            <w:rPr>
+              <w:rFonts w:eastAsiaTheme="minorEastAsia"/>
+              <w:noProof/>
+              <w:lang w:eastAsia="en-IN"/>
+            </w:rPr>
+          </w:pPr>
+          <w:hyperlink w:anchor="_Toc235529185" w:history="1">
+            <w:r>
+              <w:rPr>
+                <w:rStyle w:val="Hyperlink"/>
+                <w:noProof/>
+              </w:rPr>
+              <w:t>ESLint – Why it’s Needed</w:t>
+            </w:r>
+            <w:r>
+              <w:rPr>
+                <w:noProof/>
+                <w:webHidden/>
+              </w:rPr>
+              <w:tab/>
+            </w:r>
+            <w:r>
+              <w:rPr>
+                <w:noProof/>
+                <w:webHidden/>
+              </w:rPr>
+              <w:fldChar w:fldCharType="begin"/>
+            </w:r>
+            <w:r>
+              <w:rPr>
+                <w:noProof/>
+                <w:webHidden/>
+              </w:rPr>
+              <w:instrText xml:space="preserve"> PAGEREF _Toc235529185 \h </w:instrText>
+            </w:r>
+            <w:r>
+              <w:rPr>
+                <w:noProof/>
+                <w:webHidden/>
+              </w:rPr>
+            </w:r>
+            <w:r>
+              <w:rPr>
+                <w:noProof/>
+                <w:webHidden/>
+              </w:rPr>
+              <w:fldChar w:fldCharType="separate"/>
+            </w:r>
+            <w:r>
+              <w:rPr>
+                <w:noProof/>
+                <w:webHidden/>
+              </w:rPr>
+              <w:t>34</w:t>
+            </w:r>
+            <w:r>
+              <w:rPr>
+                <w:noProof/>
+                <w:webHidden/>
+              </w:rPr>
+              <w:fldChar w:fldCharType="end"/>
+            </w:r>
+          </w:hyperlink>
+        </w:p>
+        <w:p>
+          <w:pPr>
+            <w:pStyle w:val="TOC2"/>
+            <w:tabs>
+              <w:tab w:val="right" w:leader="dot" w:pos="9016"/>
+            </w:tabs>
+            <w:rPr>
+              <w:rFonts w:eastAsiaTheme="minorEastAsia"/>
+              <w:noProof/>
+              <w:lang w:eastAsia="en-IN"/>
+            </w:rPr>
+          </w:pPr>
+          <w:hyperlink w:anchor="_Toc235529186" w:history="1">
+            <w:r>
+              <w:rPr>
+                <w:rStyle w:val="Hyperlink"/>
+                <w:noProof/>
+              </w:rPr>
+              <w:t>.gitignore – Why it’s needed</w:t>
+            </w:r>
+            <w:r>
+              <w:rPr>
+                <w:noProof/>
+                <w:webHidden/>
+              </w:rPr>
+              <w:tab/>
+            </w:r>
+            <w:r>
+              <w:rPr>
+                <w:noProof/>
+                <w:webHidden/>
+              </w:rPr>
+              <w:fldChar w:fldCharType="begin"/>
+            </w:r>
+            <w:r>
+              <w:rPr>
+                <w:noProof/>
+                <w:webHidden/>
+              </w:rPr>
+              <w:instrText xml:space="preserve"> PAGEREF _Toc235529186 \h </w:instrText>
+            </w:r>
+            <w:r>
+              <w:rPr>
+                <w:noProof/>
+                <w:webHidden/>
+              </w:rPr>
+            </w:r>
+            <w:r>
+              <w:rPr>
+                <w:noProof/>
+                <w:webHidden/>
+              </w:rPr>
+              <w:fldChar w:fldCharType="separate"/>
+            </w:r>
+            <w:r>
+              <w:rPr>
+                <w:noProof/>
+                <w:webHidden/>
+              </w:rPr>
+              <w:t>35</w:t>
+            </w:r>
+            <w:r>
+              <w:rPr>
+                <w:noProof/>
+                <w:webHidden/>
+              </w:rPr>
+              <w:fldChar w:fldCharType="end"/>
+            </w:r>
+          </w:hyperlink>
+        </w:p>
+        <w:p>
+          <w:pPr>
+            <w:pStyle w:val="TOC2"/>
+            <w:tabs>
+              <w:tab w:val="right" w:leader="dot" w:pos="9016"/>
+            </w:tabs>
+            <w:rPr>
+              <w:rFonts w:eastAsiaTheme="minorEastAsia"/>
+              <w:noProof/>
+              <w:lang w:eastAsia="en-IN"/>
+            </w:rPr>
+          </w:pPr>
+          <w:hyperlink w:anchor="_Toc235529187" w:history="1">
+            <w:r>
+              <w:rPr>
+                <w:rStyle w:val="Hyperlink"/>
+                <w:noProof/>
+              </w:rPr>
+              <w:t>Uploading the Project to GitHub</w:t>
+            </w:r>
+            <w:r>
+              <w:rPr>
+                <w:noProof/>
+                <w:webHidden/>
+              </w:rPr>
+              <w:tab/>
+            </w:r>
+            <w:r>
+              <w:rPr>
+                <w:noProof/>
+                <w:webHidden/>
+              </w:rPr>
+              <w:fldChar w:fldCharType="begin"/>
+            </w:r>
+            <w:r>
+              <w:rPr>
+                <w:noProof/>
+                <w:webHidden/>
+              </w:rPr>
+              <w:instrText xml:space="preserve"> PAGEREF _Toc235529187 \h </w:instrText>
+            </w:r>
+            <w:r>
+              <w:rPr>
+                <w:noProof/>
+                <w:webHidden/>
+              </w:rPr>
+            </w:r>
+            <w:r>
+              <w:rPr>
+                <w:noProof/>
+                <w:webHidden/>
+              </w:rPr>
+              <w:fldChar w:fldCharType="separate"/>
+            </w:r>
+            <w:r>
+              <w:rPr>
+                <w:noProof/>
+                <w:webHidden/>
+              </w:rPr>
+              <w:t>36</w:t>
+            </w:r>
+            <w:r>
+              <w:rPr>
+                <w:noProof/>
+                <w:webHidden/>
+              </w:rPr>
+              <w:fldChar w:fldCharType="end"/>
+            </w:r>
+          </w:hyperlink>
+        </w:p>
+        <w:p>
+          <w:pPr>
+            <w:pStyle w:val="TOC1"/>
+            <w:tabs>
+              <w:tab w:val="right" w:leader="dot" w:pos="9016"/>
+            </w:tabs>
+            <w:rPr>
+              <w:rFonts w:eastAsiaTheme="minorEastAsia"/>
+              <w:noProof/>
+              <w:lang w:eastAsia="en-IN"/>
+            </w:rPr>
+          </w:pPr>
+          <w:hyperlink w:anchor="_Toc235529188" w:history="1">
+            <w:r>
+              <w:rPr>
+                <w:rStyle w:val="Hyperlink"/>
+                <w:b/>
+                <w:bCs/>
+                <w:noProof/>
+              </w:rPr>
+              <w:t>Chapter 5 - Components</w:t>
+            </w:r>
+            <w:r>
+              <w:rPr>
+                <w:noProof/>
+                <w:webHidden/>
+              </w:rPr>
+              <w:tab/>
+            </w:r>
+            <w:r>
+              <w:rPr>
+                <w:noProof/>
+                <w:webHidden/>
+              </w:rPr>
+              <w:fldChar w:fldCharType="begin"/>
+            </w:r>
+            <w:r>
+              <w:rPr>
+                <w:noProof/>
+                <w:webHidden/>
+              </w:rPr>
+              <w:instrText xml:space="preserve"> PAGEREF _Toc235529188 \h </w:instrText>
+            </w:r>
+            <w:r>
+              <w:rPr>
+                <w:noProof/>
+                <w:webHidden/>
+              </w:rPr>
+            </w:r>
+            <w:r>
+              <w:rPr>
+                <w:noProof/>
+                <w:webHidden/>
+              </w:rPr>
+              <w:fldChar w:fldCharType="separate"/>
+            </w:r>
+            <w:r>
+              <w:rPr>
+                <w:noProof/>
+                <w:webHidden/>
+              </w:rPr>
+              <w:t>37</w:t>
             </w:r>
             <w:r>
               <w:rPr>
@@ -2248,7 +2803,7 @@
           <w:bCs/>
         </w:rPr>
       </w:pPr>
-      <w:bookmarkStart w:id="0" w:name="_Toc235525331"/>
+      <w:bookmarkStart w:id="0" w:name="_Toc235529151"/>
       <w:r>
         <w:rPr>
           <w:b/>
@@ -2284,7 +2839,7 @@
       <w:pPr>
         <w:pStyle w:val="Heading2"/>
       </w:pPr>
-      <w:bookmarkStart w:id="1" w:name="_Toc235525332"/>
+      <w:bookmarkStart w:id="1" w:name="_Toc235529152"/>
       <w:r>
         <w:t>What is React JS?</w:t>
       </w:r>
@@ -2467,7 +3022,7 @@
       <w:pPr>
         <w:pStyle w:val="Heading2"/>
       </w:pPr>
-      <w:bookmarkStart w:id="2" w:name="_Toc235525333"/>
+      <w:bookmarkStart w:id="2" w:name="_Toc235529153"/>
       <w:r>
         <w:lastRenderedPageBreak/>
         <w:t>Why was React Needed ? (The Backstory)</w:t>
@@ -2591,7 +3146,7 @@
       <w:pPr>
         <w:pStyle w:val="Heading2"/>
       </w:pPr>
-      <w:bookmarkStart w:id="3" w:name="_Toc235525334"/>
+      <w:bookmarkStart w:id="3" w:name="_Toc235529154"/>
       <w:r>
         <w:lastRenderedPageBreak/>
         <w:t>Reacts Solution: Component-Based Architecture</w:t>
@@ -2695,7 +3250,7 @@
       <w:pPr>
         <w:pStyle w:val="Heading2"/>
       </w:pPr>
-      <w:bookmarkStart w:id="4" w:name="_Toc235525335"/>
+      <w:bookmarkStart w:id="4" w:name="_Toc235529155"/>
       <w:r>
         <w:lastRenderedPageBreak/>
         <w:t>Real-World Example: YouTube (SPA Concept)</w:t>
@@ -2841,7 +3396,7 @@
       <w:pPr>
         <w:pStyle w:val="Heading2"/>
       </w:pPr>
-      <w:bookmarkStart w:id="5" w:name="_Toc235525336"/>
+      <w:bookmarkStart w:id="5" w:name="_Toc235529156"/>
       <w:r>
         <w:lastRenderedPageBreak/>
         <w:t>JavaScript Prerequisites Before Learning React</w:t>
@@ -3008,7 +3563,7 @@
       <w:pPr>
         <w:pStyle w:val="Heading2"/>
       </w:pPr>
-      <w:bookmarkStart w:id="6" w:name="_Toc235525337"/>
+      <w:bookmarkStart w:id="6" w:name="_Toc235529157"/>
       <w:r>
         <w:lastRenderedPageBreak/>
         <w:t>Creating an Element – Plain JavaScript Way (Before React)</w:t>
@@ -3156,7 +3711,7 @@
       <w:pPr>
         <w:pStyle w:val="Heading2"/>
       </w:pPr>
-      <w:bookmarkStart w:id="7" w:name="_Toc235525338"/>
+      <w:bookmarkStart w:id="7" w:name="_Toc235529158"/>
       <w:r>
         <w:lastRenderedPageBreak/>
         <w:t>Library vs Framework – Key Difference</w:t>
@@ -3375,7 +3930,7 @@
       <w:pPr>
         <w:pStyle w:val="Heading3"/>
       </w:pPr>
-      <w:bookmarkStart w:id="8" w:name="_Toc235525339"/>
+      <w:bookmarkStart w:id="8" w:name="_Toc235529159"/>
       <w:r>
         <w:t>Analogy Given:</w:t>
       </w:r>
@@ -3454,7 +4009,7 @@
           <w:bCs/>
         </w:rPr>
       </w:pPr>
-      <w:bookmarkStart w:id="9" w:name="_Toc235525340"/>
+      <w:bookmarkStart w:id="9" w:name="_Toc235529160"/>
       <w:r>
         <w:rPr>
           <w:b/>
@@ -3483,7 +4038,7 @@
       <w:pPr>
         <w:pStyle w:val="Heading2"/>
       </w:pPr>
-      <w:bookmarkStart w:id="10" w:name="_Toc235525341"/>
+      <w:bookmarkStart w:id="10" w:name="_Toc235529161"/>
       <w:r>
         <w:t>Why Import / Export is Needed</w:t>
       </w:r>
@@ -3712,7 +4267,7 @@
       <w:pPr>
         <w:pStyle w:val="Heading2"/>
       </w:pPr>
-      <w:bookmarkStart w:id="11" w:name="_Toc235525342"/>
+      <w:bookmarkStart w:id="11" w:name="_Toc235529162"/>
       <w:r>
         <w:lastRenderedPageBreak/>
         <w:t>Prerequisite: Setting File Type to “module”</w:t>
@@ -3880,7 +4435,7 @@
       <w:pPr>
         <w:pStyle w:val="Heading2"/>
       </w:pPr>
-      <w:bookmarkStart w:id="12" w:name="_Toc235525343"/>
+      <w:bookmarkStart w:id="12" w:name="_Toc235529163"/>
       <w:r>
         <w:lastRenderedPageBreak/>
         <w:t>Two types of Export</w:t>
@@ -3961,7 +4516,7 @@
       <w:pPr>
         <w:pStyle w:val="Heading2"/>
       </w:pPr>
-      <w:bookmarkStart w:id="13" w:name="_Toc235525344"/>
+      <w:bookmarkStart w:id="13" w:name="_Toc235529164"/>
       <w:r>
         <w:lastRenderedPageBreak/>
         <w:t>Default Export</w:t>
@@ -4214,7 +4769,7 @@
       <w:pPr>
         <w:pStyle w:val="Heading3"/>
       </w:pPr>
-      <w:bookmarkStart w:id="14" w:name="_Toc235525345"/>
+      <w:bookmarkStart w:id="14" w:name="_Toc235529165"/>
       <w:r>
         <w:t>Example with array:</w:t>
       </w:r>
@@ -4313,7 +4868,7 @@
       <w:pPr>
         <w:pStyle w:val="Heading2"/>
       </w:pPr>
-      <w:bookmarkStart w:id="15" w:name="_Toc235525346"/>
+      <w:bookmarkStart w:id="15" w:name="_Toc235529166"/>
       <w:r>
         <w:lastRenderedPageBreak/>
         <w:t>Named Export</w:t>
@@ -4501,7 +5056,7 @@
       <w:pPr>
         <w:pStyle w:val="Heading2"/>
       </w:pPr>
-      <w:bookmarkStart w:id="16" w:name="_Toc235525347"/>
+      <w:bookmarkStart w:id="16" w:name="_Toc235529167"/>
       <w:r>
         <w:lastRenderedPageBreak/>
         <w:t>Combining Default + Named Export (same file)</w:t>
@@ -4677,7 +5232,7 @@
       <w:pPr>
         <w:pStyle w:val="Heading2"/>
       </w:pPr>
-      <w:bookmarkStart w:id="17" w:name="_Toc235525348"/>
+      <w:bookmarkStart w:id="17" w:name="_Toc235529168"/>
       <w:r>
         <w:lastRenderedPageBreak/>
         <w:t>Import from Multiple Files</w:t>
@@ -4868,7 +5423,7 @@
       <w:pPr>
         <w:pStyle w:val="Heading2"/>
       </w:pPr>
-      <w:bookmarkStart w:id="18" w:name="_Toc235525349"/>
+      <w:bookmarkStart w:id="18" w:name="_Toc235529169"/>
       <w:r>
         <w:lastRenderedPageBreak/>
         <w:t>Key Take</w:t>
@@ -5176,7 +5731,7 @@
           <w:bCs/>
         </w:rPr>
       </w:pPr>
-      <w:bookmarkStart w:id="19" w:name="_Toc235525350"/>
+      <w:bookmarkStart w:id="19" w:name="_Toc235529170"/>
       <w:r>
         <w:rPr>
           <w:b/>
@@ -5205,7 +5760,7 @@
       <w:pPr>
         <w:pStyle w:val="Heading2"/>
       </w:pPr>
-      <w:bookmarkStart w:id="20" w:name="_Toc235525351"/>
+      <w:bookmarkStart w:id="20" w:name="_Toc235529171"/>
       <w:r>
         <w:t>What is Real DOM?</w:t>
       </w:r>
@@ -5318,7 +5873,7 @@
       <w:pPr>
         <w:pStyle w:val="Heading2"/>
       </w:pPr>
-      <w:bookmarkStart w:id="21" w:name="_Toc235525352"/>
+      <w:bookmarkStart w:id="21" w:name="_Toc235529172"/>
       <w:r>
         <w:lastRenderedPageBreak/>
         <w:t>The Problem with Real DOM</w:t>
@@ -5493,7 +6048,7 @@
       <w:pPr>
         <w:pStyle w:val="Heading2"/>
       </w:pPr>
-      <w:bookmarkStart w:id="22" w:name="_Toc235525353"/>
+      <w:bookmarkStart w:id="22" w:name="_Toc235529173"/>
       <w:r>
         <w:lastRenderedPageBreak/>
         <w:t>What is Virtual DOM ?</w:t>
@@ -5698,7 +6253,7 @@
       <w:pPr>
         <w:pStyle w:val="Heading2"/>
       </w:pPr>
-      <w:bookmarkStart w:id="23" w:name="_Toc235525354"/>
+      <w:bookmarkStart w:id="23" w:name="_Toc235529174"/>
       <w:r>
         <w:lastRenderedPageBreak/>
         <w:t>Benefits of Virtual DOM</w:t>
@@ -5922,7 +6477,7 @@
       <w:pPr>
         <w:pStyle w:val="Heading2"/>
       </w:pPr>
-      <w:bookmarkStart w:id="24" w:name="_Toc235525355"/>
+      <w:bookmarkStart w:id="24" w:name="_Toc235529175"/>
       <w:r>
         <w:lastRenderedPageBreak/>
         <w:t>Introduction to JSX</w:t>
@@ -6205,7 +6760,7 @@
       <w:pPr>
         <w:pStyle w:val="Heading2"/>
       </w:pPr>
-      <w:bookmarkStart w:id="25" w:name="_Toc235525356"/>
+      <w:bookmarkStart w:id="25" w:name="_Toc235529176"/>
       <w:r>
         <w:lastRenderedPageBreak/>
         <w:t>Calling Function in JSX</w:t>
@@ -6492,7 +7047,7 @@
           <w:bCs/>
         </w:rPr>
       </w:pPr>
-      <w:bookmarkStart w:id="26" w:name="_Toc235525357"/>
+      <w:bookmarkStart w:id="26" w:name="_Toc235529177"/>
       <w:r>
         <w:rPr>
           <w:b/>
@@ -6521,7 +7076,7 @@
       <w:pPr>
         <w:pStyle w:val="Heading2"/>
       </w:pPr>
-      <w:bookmarkStart w:id="27" w:name="_Toc235525358"/>
+      <w:bookmarkStart w:id="27" w:name="_Toc235529178"/>
       <w:r>
         <w:t>What is Vite (Bundler) ?</w:t>
       </w:r>
@@ -6651,7 +7206,7 @@
       <w:pPr>
         <w:pStyle w:val="Heading2"/>
       </w:pPr>
-      <w:bookmarkStart w:id="28" w:name="_Toc235525359"/>
+      <w:bookmarkStart w:id="28" w:name="_Toc235529179"/>
       <w:r>
         <w:lastRenderedPageBreak/>
         <w:t>Vite vs Create React App (CRA)</w:t>
@@ -6813,7 +7368,7 @@
       <w:pPr>
         <w:pStyle w:val="Heading2"/>
       </w:pPr>
-      <w:bookmarkStart w:id="29" w:name="_Toc235525360"/>
+      <w:bookmarkStart w:id="29" w:name="_Toc235529180"/>
       <w:r>
         <w:lastRenderedPageBreak/>
         <w:t>Creating a React Project with Vite – Step–by–Step</w:t>
@@ -7300,10 +7855,12 @@
       <w:pPr>
         <w:pStyle w:val="Heading2"/>
       </w:pPr>
+      <w:bookmarkStart w:id="30" w:name="_Toc235529181"/>
       <w:r>
         <w:lastRenderedPageBreak/>
         <w:t>Folder Structure Overview (What Vite Generates)</w:t>
       </w:r>
+      <w:bookmarkEnd w:id="30"/>
     </w:p>
     <w:p/>
     <w:tbl>
@@ -7956,6 +8513,7 @@
           <w:iCs/>
         </w:rPr>
       </w:pPr>
+      <w:bookmarkStart w:id="31" w:name="_Toc235529182"/>
       <w:r>
         <w:lastRenderedPageBreak/>
         <w:t xml:space="preserve">Understanding </w:t>
@@ -7981,6 +8539,7 @@
         </w:rPr>
         <w:t>main.jsx</w:t>
       </w:r>
+      <w:bookmarkEnd w:id="31"/>
     </w:p>
     <w:p>
       <w:pPr>
@@ -8507,10 +9066,12 @@
       <w:pPr>
         <w:pStyle w:val="Heading2"/>
       </w:pPr>
+      <w:bookmarkStart w:id="32" w:name="_Toc235529183"/>
       <w:r>
         <w:lastRenderedPageBreak/>
         <w:t>The Rendering Chain (Hierarchy)</w:t>
       </w:r>
+      <w:bookmarkEnd w:id="32"/>
     </w:p>
     <w:p>
       <w:pPr>
@@ -8610,10 +9171,12 @@
       <w:pPr>
         <w:pStyle w:val="Heading2"/>
       </w:pPr>
+      <w:bookmarkStart w:id="33" w:name="_Toc235529184"/>
       <w:r>
         <w:lastRenderedPageBreak/>
         <w:t>CSS in the Project</w:t>
       </w:r>
+      <w:bookmarkEnd w:id="33"/>
     </w:p>
     <w:p>
       <w:pPr>
@@ -8690,10 +9253,12 @@
       <w:pPr>
         <w:pStyle w:val="Heading2"/>
       </w:pPr>
+      <w:bookmarkStart w:id="34" w:name="_Toc235529185"/>
       <w:r>
         <w:lastRenderedPageBreak/>
         <w:t>ESLint – Why it’s Needed</w:t>
       </w:r>
+      <w:bookmarkEnd w:id="34"/>
     </w:p>
     <w:p>
       <w:pPr>
@@ -8895,10 +9460,12 @@
       <w:pPr>
         <w:pStyle w:val="Heading2"/>
       </w:pPr>
+      <w:bookmarkStart w:id="35" w:name="_Toc235529186"/>
       <w:r>
         <w:lastRenderedPageBreak/>
         <w:t>.gitignore – Why it’s needed</w:t>
       </w:r>
+      <w:bookmarkEnd w:id="35"/>
     </w:p>
     <w:p>
       <w:pPr>
@@ -9042,10 +9609,12 @@
       <w:pPr>
         <w:pStyle w:val="Heading2"/>
       </w:pPr>
+      <w:bookmarkStart w:id="36" w:name="_Toc235529187"/>
       <w:r>
         <w:lastRenderedPageBreak/>
         <w:t>Uploading the Project to GitHub</w:t>
       </w:r>
+      <w:bookmarkEnd w:id="36"/>
     </w:p>
     <w:p>
       <w:r>
@@ -9151,6 +9720,30 @@
       <w:r>
         <w:t>After pushing, refresh the GitHub repo page — the uploaded folder and source code will now be visible there.</w:t>
       </w:r>
+    </w:p>
+    <w:p>
+      <w:r>
+        <w:br w:type="page"/>
+      </w:r>
+    </w:p>
+    <w:p>
+      <w:pPr>
+        <w:pStyle w:val="Heading1"/>
+        <w:rPr>
+          <w:b/>
+          <w:bCs/>
+        </w:rPr>
+      </w:pPr>
+      <w:bookmarkStart w:id="37" w:name="_Toc235529188"/>
+      <w:r>
+        <w:rPr>
+          <w:b/>
+          <w:bCs/>
+        </w:rPr>
+        <w:lastRenderedPageBreak/>
+        <w:t>Chapter 5 - Components</w:t>
+      </w:r>
+      <w:bookmarkEnd w:id="37"/>
     </w:p>
     <w:sectPr>
       <w:pgSz w:w="11906" w:h="16838"/>

</xml_diff>

<commit_message>
React JS - Completed till 07. Mini Project using Props
</commit_message>
<xml_diff>
--- a/React JS.docx
+++ b/React JS.docx
@@ -5512,25 +5512,7 @@
                 <w:bCs/>
                 <w:noProof/>
               </w:rPr>
-              <w:t>Chapter 6 – Un</w:t>
-            </w:r>
-            <w:r>
-              <w:rPr>
-                <w:rStyle w:val="Hyperlink"/>
-                <w:b/>
-                <w:bCs/>
-                <w:noProof/>
-              </w:rPr>
-              <w:t>d</w:t>
-            </w:r>
-            <w:r>
-              <w:rPr>
-                <w:rStyle w:val="Hyperlink"/>
-                <w:b/>
-                <w:bCs/>
-                <w:noProof/>
-              </w:rPr>
-              <w:t>erstanding Props</w:t>
+              <w:t>Chapter 6 – Understanding Props</w:t>
             </w:r>
             <w:r>
               <w:rPr>
@@ -6432,7 +6414,7 @@
                     <pic:cNvPicPr/>
                   </pic:nvPicPr>
                   <pic:blipFill>
-                    <a:blip r:embed="rId6"/>
+                    <a:blip r:embed="rId8"/>
                     <a:stretch>
                       <a:fillRect/>
                     </a:stretch>
@@ -6474,7 +6456,7 @@
                     <pic:cNvPicPr/>
                   </pic:nvPicPr>
                   <pic:blipFill>
-                    <a:blip r:embed="rId7"/>
+                    <a:blip r:embed="rId9"/>
                     <a:stretch>
                       <a:fillRect/>
                     </a:stretch>
@@ -6504,6 +6486,7 @@
         </w:numPr>
       </w:pPr>
       <w:r>
+        <w:lastRenderedPageBreak/>
         <w:t xml:space="preserve">This is the </w:t>
       </w:r>
       <w:r>
@@ -6937,7 +6920,7 @@
                     <pic:cNvPicPr/>
                   </pic:nvPicPr>
                   <pic:blipFill>
-                    <a:blip r:embed="rId8"/>
+                    <a:blip r:embed="rId10"/>
                     <a:stretch>
                       <a:fillRect/>
                     </a:stretch>
@@ -6963,6 +6946,7 @@
         <w:rPr>
           <w:noProof/>
         </w:rPr>
+        <w:lastRenderedPageBreak/>
         <w:drawing>
           <wp:inline distT="0" distB="0" distL="0" distR="0" wp14:anchorId="6C5F18E1" wp14:editId="63023D65">
             <wp:extent cx="5731510" cy="760095"/>
@@ -6979,7 +6963,7 @@
                     <pic:cNvPicPr/>
                   </pic:nvPicPr>
                   <pic:blipFill>
-                    <a:blip r:embed="rId9"/>
+                    <a:blip r:embed="rId11"/>
                     <a:stretch>
                       <a:fillRect/>
                     </a:stretch>
@@ -7021,7 +7005,7 @@
                     <pic:cNvPicPr/>
                   </pic:nvPicPr>
                   <pic:blipFill>
-                    <a:blip r:embed="rId10"/>
+                    <a:blip r:embed="rId12"/>
                     <a:stretch>
                       <a:fillRect/>
                     </a:stretch>
@@ -7133,7 +7117,7 @@
                     <pic:cNvPicPr/>
                   </pic:nvPicPr>
                   <pic:blipFill>
-                    <a:blip r:embed="rId11"/>
+                    <a:blip r:embed="rId13"/>
                     <a:stretch>
                       <a:fillRect/>
                     </a:stretch>
@@ -7407,208 +7391,6 @@
                 <pic:pic xmlns:pic="http://schemas.openxmlformats.org/drawingml/2006/picture">
                   <pic:nvPicPr>
                     <pic:cNvPr id="43902797" name=""/>
-                    <pic:cNvPicPr/>
-                  </pic:nvPicPr>
-                  <pic:blipFill>
-                    <a:blip r:embed="rId12"/>
-                    <a:stretch>
-                      <a:fillRect/>
-                    </a:stretch>
-                  </pic:blipFill>
-                  <pic:spPr>
-                    <a:xfrm>
-                      <a:off x="0" y="0"/>
-                      <a:ext cx="5731510" cy="1092200"/>
-                    </a:xfrm>
-                    <a:prstGeom prst="rect">
-                      <a:avLst/>
-                    </a:prstGeom>
-                  </pic:spPr>
-                </pic:pic>
-              </a:graphicData>
-            </a:graphic>
-          </wp:inline>
-        </w:drawing>
-      </w:r>
-    </w:p>
-    <w:p>
-      <w:pPr>
-        <w:rPr>
-          <w:b/>
-          <w:bCs/>
-        </w:rPr>
-      </w:pPr>
-    </w:p>
-    <w:p>
-      <w:pPr>
-        <w:pStyle w:val="ListParagraph"/>
-        <w:numPr>
-          <w:ilvl w:val="0"/>
-          <w:numId w:val="11"/>
-        </w:numPr>
-        <w:rPr>
-          <w:b/>
-          <w:bCs/>
-        </w:rPr>
-      </w:pPr>
-      <w:r>
-        <w:rPr>
-          <w:b/>
-          <w:bCs/>
-        </w:rPr>
-        <w:t>Syntax (import)</w:t>
-      </w:r>
-      <w:r>
-        <w:rPr>
-          <w:b/>
-          <w:bCs/>
-        </w:rPr>
-        <w:t>:</w:t>
-      </w:r>
-    </w:p>
-    <w:p>
-      <w:pPr>
-        <w:rPr>
-          <w:b/>
-          <w:bCs/>
-        </w:rPr>
-      </w:pPr>
-      <w:r>
-        <w:rPr>
-          <w:b/>
-          <w:bCs/>
-          <w:noProof/>
-        </w:rPr>
-        <w:drawing>
-          <wp:inline distT="0" distB="0" distL="0" distR="0" wp14:anchorId="1219B7B8" wp14:editId="688C4DC1">
-            <wp:extent cx="5731510" cy="1092200"/>
-            <wp:effectExtent l="0" t="0" r="2540" b="0"/>
-            <wp:docPr id="2023915729" name="Picture 1"/>
-            <wp:cNvGraphicFramePr>
-              <a:graphicFrameLocks xmlns:a="http://schemas.openxmlformats.org/drawingml/2006/main" noChangeAspect="1"/>
-            </wp:cNvGraphicFramePr>
-            <a:graphic xmlns:a="http://schemas.openxmlformats.org/drawingml/2006/main">
-              <a:graphicData uri="http://schemas.openxmlformats.org/drawingml/2006/picture">
-                <pic:pic xmlns:pic="http://schemas.openxmlformats.org/drawingml/2006/picture">
-                  <pic:nvPicPr>
-                    <pic:cNvPr id="2023915729" name=""/>
-                    <pic:cNvPicPr/>
-                  </pic:nvPicPr>
-                  <pic:blipFill>
-                    <a:blip r:embed="rId13"/>
-                    <a:stretch>
-                      <a:fillRect/>
-                    </a:stretch>
-                  </pic:blipFill>
-                  <pic:spPr>
-                    <a:xfrm>
-                      <a:off x="0" y="0"/>
-                      <a:ext cx="5731510" cy="1092200"/>
-                    </a:xfrm>
-                    <a:prstGeom prst="rect">
-                      <a:avLst/>
-                    </a:prstGeom>
-                  </pic:spPr>
-                </pic:pic>
-              </a:graphicData>
-            </a:graphic>
-          </wp:inline>
-        </w:drawing>
-      </w:r>
-    </w:p>
-    <w:p>
-      <w:pPr>
-        <w:rPr>
-          <w:b/>
-          <w:bCs/>
-        </w:rPr>
-      </w:pPr>
-    </w:p>
-    <w:p>
-      <w:pPr>
-        <w:pStyle w:val="ListParagraph"/>
-        <w:numPr>
-          <w:ilvl w:val="0"/>
-          <w:numId w:val="11"/>
-        </w:numPr>
-        <w:rPr>
-          <w:b/>
-          <w:bCs/>
-        </w:rPr>
-      </w:pPr>
-      <w:r>
-        <w:rPr>
-          <w:b/>
-          <w:bCs/>
-        </w:rPr>
-        <w:t xml:space="preserve">Key rule: </w:t>
-      </w:r>
-      <w:r>
-        <w:t xml:space="preserve">When importing a </w:t>
-      </w:r>
-      <w:r>
-        <w:rPr>
-          <w:b/>
-          <w:bCs/>
-        </w:rPr>
-        <w:t>default export</w:t>
-      </w:r>
-      <w:r>
-        <w:t xml:space="preserve">, you can give it </w:t>
-      </w:r>
-      <w:r>
-        <w:rPr>
-          <w:b/>
-          <w:bCs/>
-        </w:rPr>
-        <w:t xml:space="preserve">any name </w:t>
-      </w:r>
-      <w:r>
-        <w:rPr>
-          <w:b/>
-          <w:bCs/>
-        </w:rPr>
-        <w:t>we</w:t>
-      </w:r>
-      <w:r>
-        <w:rPr>
-          <w:b/>
-          <w:bCs/>
-        </w:rPr>
-        <w:t xml:space="preserve"> like</w:t>
-      </w:r>
-      <w:r>
-        <w:t xml:space="preserve"> — it doesn't have to match the original variable name.</w:t>
-      </w:r>
-    </w:p>
-    <w:p>
-      <w:pPr>
-        <w:pStyle w:val="Heading3"/>
-      </w:pPr>
-      <w:bookmarkStart w:id="14" w:name="_Toc235624396"/>
-      <w:r>
-        <w:t>Example with array:</w:t>
-      </w:r>
-      <w:bookmarkEnd w:id="14"/>
-    </w:p>
-    <w:p>
-      <w:r>
-        <w:rPr>
-          <w:noProof/>
-        </w:rPr>
-        <w:drawing>
-          <wp:inline distT="0" distB="0" distL="0" distR="0" wp14:anchorId="6B558387" wp14:editId="3B4F9C07">
-            <wp:extent cx="5731510" cy="1092200"/>
-            <wp:effectExtent l="0" t="0" r="2540" b="0"/>
-            <wp:docPr id="1058623643" name="Picture 1"/>
-            <wp:cNvGraphicFramePr>
-              <a:graphicFrameLocks xmlns:a="http://schemas.openxmlformats.org/drawingml/2006/main" noChangeAspect="1"/>
-            </wp:cNvGraphicFramePr>
-            <a:graphic xmlns:a="http://schemas.openxmlformats.org/drawingml/2006/main">
-              <a:graphicData uri="http://schemas.openxmlformats.org/drawingml/2006/picture">
-                <pic:pic xmlns:pic="http://schemas.openxmlformats.org/drawingml/2006/picture">
-                  <pic:nvPicPr>
-                    <pic:cNvPr id="1058623643" name=""/>
                     <pic:cNvPicPr/>
                   </pic:nvPicPr>
                   <pic:blipFill>
@@ -7634,15 +7416,58 @@
       </w:r>
     </w:p>
     <w:p>
-      <w:r>
-        <w:rPr>
+      <w:pPr>
+        <w:rPr>
+          <w:b/>
+          <w:bCs/>
+        </w:rPr>
+      </w:pPr>
+    </w:p>
+    <w:p>
+      <w:pPr>
+        <w:pStyle w:val="ListParagraph"/>
+        <w:numPr>
+          <w:ilvl w:val="0"/>
+          <w:numId w:val="11"/>
+        </w:numPr>
+        <w:rPr>
+          <w:b/>
+          <w:bCs/>
+        </w:rPr>
+      </w:pPr>
+      <w:r>
+        <w:rPr>
+          <w:b/>
+          <w:bCs/>
+        </w:rPr>
+        <w:t>Syntax (import)</w:t>
+      </w:r>
+      <w:r>
+        <w:rPr>
+          <w:b/>
+          <w:bCs/>
+        </w:rPr>
+        <w:t>:</w:t>
+      </w:r>
+    </w:p>
+    <w:p>
+      <w:pPr>
+        <w:rPr>
+          <w:b/>
+          <w:bCs/>
+        </w:rPr>
+      </w:pPr>
+      <w:r>
+        <w:rPr>
+          <w:b/>
+          <w:bCs/>
           <w:noProof/>
         </w:rPr>
         <w:drawing>
-          <wp:inline distT="0" distB="0" distL="0" distR="0" wp14:anchorId="7DD74E12" wp14:editId="5507B116">
+          <wp:inline distT="0" distB="0" distL="0" distR="0" wp14:anchorId="1219B7B8" wp14:editId="688C4DC1">
             <wp:extent cx="5731510" cy="1092200"/>
             <wp:effectExtent l="0" t="0" r="2540" b="0"/>
-            <wp:docPr id="1684082968" name="Picture 1"/>
+            <wp:docPr id="2023915729" name="Picture 1"/>
             <wp:cNvGraphicFramePr>
               <a:graphicFrameLocks xmlns:a="http://schemas.openxmlformats.org/drawingml/2006/main" noChangeAspect="1"/>
             </wp:cNvGraphicFramePr>
@@ -7650,7 +7475,7 @@
               <a:graphicData uri="http://schemas.openxmlformats.org/drawingml/2006/picture">
                 <pic:pic xmlns:pic="http://schemas.openxmlformats.org/drawingml/2006/picture">
                   <pic:nvPicPr>
-                    <pic:cNvPr id="1684082968" name=""/>
+                    <pic:cNvPr id="2023915729" name=""/>
                     <pic:cNvPicPr/>
                   </pic:nvPicPr>
                   <pic:blipFill>
@@ -7676,6 +7501,166 @@
       </w:r>
     </w:p>
     <w:p>
+      <w:pPr>
+        <w:rPr>
+          <w:b/>
+          <w:bCs/>
+        </w:rPr>
+      </w:pPr>
+    </w:p>
+    <w:p>
+      <w:pPr>
+        <w:pStyle w:val="ListParagraph"/>
+        <w:numPr>
+          <w:ilvl w:val="0"/>
+          <w:numId w:val="11"/>
+        </w:numPr>
+        <w:rPr>
+          <w:b/>
+          <w:bCs/>
+        </w:rPr>
+      </w:pPr>
+      <w:r>
+        <w:rPr>
+          <w:b/>
+          <w:bCs/>
+        </w:rPr>
+        <w:t xml:space="preserve">Key rule: </w:t>
+      </w:r>
+      <w:r>
+        <w:t xml:space="preserve">When importing a </w:t>
+      </w:r>
+      <w:r>
+        <w:rPr>
+          <w:b/>
+          <w:bCs/>
+        </w:rPr>
+        <w:t>default export</w:t>
+      </w:r>
+      <w:r>
+        <w:t xml:space="preserve">, you can give it </w:t>
+      </w:r>
+      <w:r>
+        <w:rPr>
+          <w:b/>
+          <w:bCs/>
+        </w:rPr>
+        <w:t xml:space="preserve">any name </w:t>
+      </w:r>
+      <w:r>
+        <w:rPr>
+          <w:b/>
+          <w:bCs/>
+        </w:rPr>
+        <w:t>we</w:t>
+      </w:r>
+      <w:r>
+        <w:rPr>
+          <w:b/>
+          <w:bCs/>
+        </w:rPr>
+        <w:t xml:space="preserve"> like</w:t>
+      </w:r>
+      <w:r>
+        <w:t xml:space="preserve"> — it doesn't have to match the original variable name.</w:t>
+      </w:r>
+    </w:p>
+    <w:p>
+      <w:pPr>
+        <w:pStyle w:val="Heading3"/>
+      </w:pPr>
+      <w:bookmarkStart w:id="14" w:name="_Toc235624396"/>
+      <w:r>
+        <w:lastRenderedPageBreak/>
+        <w:t>Example with array:</w:t>
+      </w:r>
+      <w:bookmarkEnd w:id="14"/>
+    </w:p>
+    <w:p>
+      <w:r>
+        <w:rPr>
+          <w:noProof/>
+        </w:rPr>
+        <w:drawing>
+          <wp:inline distT="0" distB="0" distL="0" distR="0" wp14:anchorId="6B558387" wp14:editId="3B4F9C07">
+            <wp:extent cx="5731510" cy="1092200"/>
+            <wp:effectExtent l="0" t="0" r="2540" b="0"/>
+            <wp:docPr id="1058623643" name="Picture 1"/>
+            <wp:cNvGraphicFramePr>
+              <a:graphicFrameLocks xmlns:a="http://schemas.openxmlformats.org/drawingml/2006/main" noChangeAspect="1"/>
+            </wp:cNvGraphicFramePr>
+            <a:graphic xmlns:a="http://schemas.openxmlformats.org/drawingml/2006/main">
+              <a:graphicData uri="http://schemas.openxmlformats.org/drawingml/2006/picture">
+                <pic:pic xmlns:pic="http://schemas.openxmlformats.org/drawingml/2006/picture">
+                  <pic:nvPicPr>
+                    <pic:cNvPr id="1058623643" name=""/>
+                    <pic:cNvPicPr/>
+                  </pic:nvPicPr>
+                  <pic:blipFill>
+                    <a:blip r:embed="rId16"/>
+                    <a:stretch>
+                      <a:fillRect/>
+                    </a:stretch>
+                  </pic:blipFill>
+                  <pic:spPr>
+                    <a:xfrm>
+                      <a:off x="0" y="0"/>
+                      <a:ext cx="5731510" cy="1092200"/>
+                    </a:xfrm>
+                    <a:prstGeom prst="rect">
+                      <a:avLst/>
+                    </a:prstGeom>
+                  </pic:spPr>
+                </pic:pic>
+              </a:graphicData>
+            </a:graphic>
+          </wp:inline>
+        </w:drawing>
+      </w:r>
+    </w:p>
+    <w:p>
+      <w:r>
+        <w:rPr>
+          <w:noProof/>
+        </w:rPr>
+        <w:drawing>
+          <wp:inline distT="0" distB="0" distL="0" distR="0" wp14:anchorId="7DD74E12" wp14:editId="5507B116">
+            <wp:extent cx="5731510" cy="1092200"/>
+            <wp:effectExtent l="0" t="0" r="2540" b="0"/>
+            <wp:docPr id="1684082968" name="Picture 1"/>
+            <wp:cNvGraphicFramePr>
+              <a:graphicFrameLocks xmlns:a="http://schemas.openxmlformats.org/drawingml/2006/main" noChangeAspect="1"/>
+            </wp:cNvGraphicFramePr>
+            <a:graphic xmlns:a="http://schemas.openxmlformats.org/drawingml/2006/main">
+              <a:graphicData uri="http://schemas.openxmlformats.org/drawingml/2006/picture">
+                <pic:pic xmlns:pic="http://schemas.openxmlformats.org/drawingml/2006/picture">
+                  <pic:nvPicPr>
+                    <pic:cNvPr id="1684082968" name=""/>
+                    <pic:cNvPicPr/>
+                  </pic:nvPicPr>
+                  <pic:blipFill>
+                    <a:blip r:embed="rId17"/>
+                    <a:stretch>
+                      <a:fillRect/>
+                    </a:stretch>
+                  </pic:blipFill>
+                  <pic:spPr>
+                    <a:xfrm>
+                      <a:off x="0" y="0"/>
+                      <a:ext cx="5731510" cy="1092200"/>
+                    </a:xfrm>
+                    <a:prstGeom prst="rect">
+                      <a:avLst/>
+                    </a:prstGeom>
+                  </pic:spPr>
+                </pic:pic>
+              </a:graphicData>
+            </a:graphic>
+          </wp:inline>
+        </w:drawing>
+      </w:r>
+    </w:p>
+    <w:p>
       <w:r>
         <w:br w:type="page"/>
       </w:r>
@@ -7753,7 +7738,7 @@
                     <pic:cNvPicPr/>
                   </pic:nvPicPr>
                   <pic:blipFill>
-                    <a:blip r:embed="rId16"/>
+                    <a:blip r:embed="rId18"/>
                     <a:stretch>
                       <a:fillRect/>
                     </a:stretch>
@@ -7795,7 +7780,7 @@
                     <pic:cNvPicPr/>
                   </pic:nvPicPr>
                   <pic:blipFill>
-                    <a:blip r:embed="rId17"/>
+                    <a:blip r:embed="rId19"/>
                     <a:stretch>
                       <a:fillRect/>
                     </a:stretch>
@@ -7934,7 +7919,7 @@
                     <pic:cNvPicPr/>
                   </pic:nvPicPr>
                   <pic:blipFill>
-                    <a:blip r:embed="rId18"/>
+                    <a:blip r:embed="rId20"/>
                     <a:stretch>
                       <a:fillRect/>
                     </a:stretch>
@@ -7976,7 +7961,7 @@
                     <pic:cNvPicPr/>
                   </pic:nvPicPr>
                   <pic:blipFill>
-                    <a:blip r:embed="rId19"/>
+                    <a:blip r:embed="rId21"/>
                     <a:stretch>
                       <a:fillRect/>
                     </a:stretch>
@@ -8002,6 +7987,7 @@
         <w:rPr>
           <w:noProof/>
         </w:rPr>
+        <w:lastRenderedPageBreak/>
         <w:drawing>
           <wp:inline distT="0" distB="0" distL="0" distR="0" wp14:anchorId="4F76BA67" wp14:editId="7FB17867">
             <wp:extent cx="5731510" cy="1531620"/>
@@ -8018,7 +8004,7 @@
                     <pic:cNvPicPr/>
                   </pic:nvPicPr>
                   <pic:blipFill>
-                    <a:blip r:embed="rId20"/>
+                    <a:blip r:embed="rId22"/>
                     <a:stretch>
                       <a:fillRect/>
                     </a:stretch>
@@ -8079,7 +8065,7 @@
                     <pic:cNvPicPr/>
                   </pic:nvPicPr>
                   <pic:blipFill>
-                    <a:blip r:embed="rId21"/>
+                    <a:blip r:embed="rId23"/>
                     <a:stretch>
                       <a:fillRect/>
                     </a:stretch>
@@ -8124,7 +8110,7 @@
                     <pic:cNvPicPr/>
                   </pic:nvPicPr>
                   <pic:blipFill>
-                    <a:blip r:embed="rId22"/>
+                    <a:blip r:embed="rId24"/>
                     <a:stretch>
                       <a:fillRect/>
                     </a:stretch>
@@ -8153,6 +8139,7 @@
         <w:rPr>
           <w:noProof/>
         </w:rPr>
+        <w:lastRenderedPageBreak/>
         <w:drawing>
           <wp:inline distT="0" distB="0" distL="0" distR="0" wp14:anchorId="2E03C187" wp14:editId="67C0392B">
             <wp:extent cx="4610100" cy="1612973"/>
@@ -8169,7 +8156,7 @@
                     <pic:cNvPicPr/>
                   </pic:nvPicPr>
                   <pic:blipFill>
-                    <a:blip r:embed="rId23"/>
+                    <a:blip r:embed="rId25"/>
                     <a:stretch>
                       <a:fillRect/>
                     </a:stretch>
@@ -8214,7 +8201,7 @@
                     <pic:cNvPicPr/>
                   </pic:nvPicPr>
                   <pic:blipFill>
-                    <a:blip r:embed="rId24"/>
+                    <a:blip r:embed="rId26"/>
                     <a:stretch>
                       <a:fillRect/>
                     </a:stretch>
@@ -8241,7 +8228,6 @@
       </w:pPr>
       <w:bookmarkStart w:id="18" w:name="_Toc235624400"/>
       <w:r>
-        <w:lastRenderedPageBreak/>
         <w:t>Key Take</w:t>
       </w:r>
       <w:r>
@@ -8256,7 +8242,7 @@
       <w:tblPr>
         <w:tblStyle w:val="GridTable4-Accent1"/>
         <w:tblW w:w="11052" w:type="dxa"/>
-        <w:tblInd w:w="-998" w:type="dxa"/>
+        <w:jc w:val="center"/>
         <w:tblLook w:val="04A0" w:firstRow="1" w:lastRow="0" w:firstColumn="1" w:lastColumn="0" w:noHBand="0" w:noVBand="1"/>
       </w:tblPr>
       <w:tblGrid>
@@ -8267,6 +8253,7 @@
       <w:tr>
         <w:trPr>
           <w:cnfStyle w:val="100000000000" w:firstRow="1" w:lastRow="0" w:firstColumn="0" w:lastColumn="0" w:oddVBand="0" w:evenVBand="0" w:oddHBand="0" w:evenHBand="0" w:firstRowFirstColumn="0" w:firstRowLastColumn="0" w:lastRowFirstColumn="0" w:lastRowLastColumn="0"/>
+          <w:jc w:val="center"/>
         </w:trPr>
         <w:tc>
           <w:tcPr>
@@ -8315,6 +8302,7 @@
         <w:trPr>
           <w:cnfStyle w:val="000000100000" w:firstRow="0" w:lastRow="0" w:firstColumn="0" w:lastColumn="0" w:oddVBand="0" w:evenVBand="0" w:oddHBand="1" w:evenHBand="0" w:firstRowFirstColumn="0" w:firstRowLastColumn="0" w:lastRowFirstColumn="0" w:lastRowLastColumn="0"/>
           <w:trHeight w:val="441"/>
+          <w:jc w:val="center"/>
         </w:trPr>
         <w:tc>
           <w:tcPr>
@@ -8360,6 +8348,7 @@
       <w:tr>
         <w:trPr>
           <w:trHeight w:val="715"/>
+          <w:jc w:val="center"/>
         </w:trPr>
         <w:tc>
           <w:tcPr>
@@ -8435,6 +8424,7 @@
         <w:trPr>
           <w:cnfStyle w:val="000000100000" w:firstRow="0" w:lastRow="0" w:firstColumn="0" w:lastColumn="0" w:oddVBand="0" w:evenVBand="0" w:oddHBand="1" w:evenHBand="0" w:firstRowFirstColumn="0" w:firstRowLastColumn="0" w:lastRowFirstColumn="0" w:lastRowLastColumn="0"/>
           <w:trHeight w:val="539"/>
+          <w:jc w:val="center"/>
         </w:trPr>
         <w:tc>
           <w:tcPr>
@@ -8475,6 +8465,9 @@
         </w:tc>
       </w:tr>
       <w:tr>
+        <w:trPr>
+          <w:jc w:val="center"/>
+        </w:trPr>
         <w:tc>
           <w:tcPr>
             <w:cnfStyle w:val="001000000000" w:firstRow="0" w:lastRow="0" w:firstColumn="1" w:lastColumn="0" w:oddVBand="0" w:evenVBand="0" w:oddHBand="0" w:evenHBand="0" w:firstRowFirstColumn="0" w:firstRowLastColumn="0" w:lastRowFirstColumn="0" w:lastRowLastColumn="0"/>
@@ -8482,6 +8475,7 @@
           </w:tcPr>
           <w:p>
             <w:r>
+              <w:lastRenderedPageBreak/>
               <w:t>Can coexist in same file ?</w:t>
             </w:r>
           </w:p>
@@ -8648,7 +8642,7 @@
                     <pic:cNvPicPr/>
                   </pic:nvPicPr>
                   <pic:blipFill>
-                    <a:blip r:embed="rId25"/>
+                    <a:blip r:embed="rId27"/>
                     <a:stretch>
                       <a:fillRect/>
                     </a:stretch>
@@ -9410,7 +9404,7 @@
                     <pic:cNvPicPr/>
                   </pic:nvPicPr>
                   <pic:blipFill>
-                    <a:blip r:embed="rId26"/>
+                    <a:blip r:embed="rId28"/>
                     <a:stretch>
                       <a:fillRect/>
                     </a:stretch>
@@ -9445,6 +9439,7 @@
           <w:bCs/>
           <w:noProof/>
         </w:rPr>
+        <w:lastRenderedPageBreak/>
         <w:drawing>
           <wp:inline distT="0" distB="0" distL="0" distR="0" wp14:anchorId="2DC193DB" wp14:editId="3616E7A2">
             <wp:extent cx="5731510" cy="1424305"/>
@@ -9461,7 +9456,7 @@
                     <pic:cNvPicPr/>
                   </pic:nvPicPr>
                   <pic:blipFill>
-                    <a:blip r:embed="rId27"/>
+                    <a:blip r:embed="rId29"/>
                     <a:stretch>
                       <a:fillRect/>
                     </a:stretch>
@@ -9538,7 +9533,7 @@
                     <pic:cNvPicPr/>
                   </pic:nvPicPr>
                   <pic:blipFill>
-                    <a:blip r:embed="rId28"/>
+                    <a:blip r:embed="rId30"/>
                     <a:stretch>
                       <a:fillRect/>
                     </a:stretch>
@@ -9645,7 +9640,7 @@
                     <pic:cNvPicPr/>
                   </pic:nvPicPr>
                   <pic:blipFill>
-                    <a:blip r:embed="rId29"/>
+                    <a:blip r:embed="rId31"/>
                     <a:stretch>
                       <a:fillRect/>
                     </a:stretch>
@@ -9738,7 +9733,7 @@
                     <pic:cNvPicPr/>
                   </pic:nvPicPr>
                   <pic:blipFill>
-                    <a:blip r:embed="rId30"/>
+                    <a:blip r:embed="rId32"/>
                     <a:stretch>
                       <a:fillRect/>
                     </a:stretch>
@@ -9792,6 +9787,7 @@
           <w:bCs/>
           <w:noProof/>
         </w:rPr>
+        <w:lastRenderedPageBreak/>
         <w:drawing>
           <wp:inline distT="0" distB="0" distL="0" distR="0" wp14:anchorId="03C61EA3" wp14:editId="47C0719D">
             <wp:extent cx="5731510" cy="1445260"/>
@@ -9808,7 +9804,7 @@
                     <pic:cNvPicPr/>
                   </pic:nvPicPr>
                   <pic:blipFill>
-                    <a:blip r:embed="rId31"/>
+                    <a:blip r:embed="rId33"/>
                     <a:stretch>
                       <a:fillRect/>
                     </a:stretch>
@@ -10219,7 +10215,7 @@
                     <pic:cNvPicPr/>
                   </pic:nvPicPr>
                   <pic:blipFill>
-                    <a:blip r:embed="rId32"/>
+                    <a:blip r:embed="rId34"/>
                     <a:stretch>
                       <a:fillRect/>
                     </a:stretch>
@@ -10453,7 +10449,7 @@
                     <pic:cNvPicPr/>
                   </pic:nvPicPr>
                   <pic:blipFill>
-                    <a:blip r:embed="rId33"/>
+                    <a:blip r:embed="rId35"/>
                     <a:stretch>
                       <a:fillRect/>
                     </a:stretch>
@@ -10494,6 +10490,7 @@
         <w:rPr>
           <w:noProof/>
         </w:rPr>
+        <w:lastRenderedPageBreak/>
         <w:drawing>
           <wp:inline distT="0" distB="0" distL="0" distR="0" wp14:anchorId="79C1E649" wp14:editId="1EAC7762">
             <wp:extent cx="3371850" cy="1295400"/>
@@ -10510,7 +10507,7 @@
                     <pic:cNvPicPr/>
                   </pic:nvPicPr>
                   <pic:blipFill>
-                    <a:blip r:embed="rId34"/>
+                    <a:blip r:embed="rId36"/>
                     <a:stretch>
                       <a:fillRect/>
                     </a:stretch>
@@ -10598,7 +10595,7 @@
                     <pic:cNvPicPr/>
                   </pic:nvPicPr>
                   <pic:blipFill>
-                    <a:blip r:embed="rId35"/>
+                    <a:blip r:embed="rId37"/>
                     <a:stretch>
                       <a:fillRect/>
                     </a:stretch>
@@ -11434,7 +11431,7 @@
                     <pic:cNvPicPr/>
                   </pic:nvPicPr>
                   <pic:blipFill>
-                    <a:blip r:embed="rId36"/>
+                    <a:blip r:embed="rId38"/>
                     <a:stretch>
                       <a:fillRect/>
                     </a:stretch>
@@ -11498,6 +11495,7 @@
         <w:rPr>
           <w:noProof/>
         </w:rPr>
+        <w:lastRenderedPageBreak/>
         <w:drawing>
           <wp:inline distT="0" distB="0" distL="0" distR="0" wp14:anchorId="1FA9A332" wp14:editId="2242CDC6">
             <wp:extent cx="5731510" cy="2338070"/>
@@ -11514,7 +11512,7 @@
                     <pic:cNvPicPr/>
                   </pic:nvPicPr>
                   <pic:blipFill>
-                    <a:blip r:embed="rId37"/>
+                    <a:blip r:embed="rId39"/>
                     <a:stretch>
                       <a:fillRect/>
                     </a:stretch>
@@ -11668,7 +11666,7 @@
                     <pic:cNvPicPr/>
                   </pic:nvPicPr>
                   <pic:blipFill>
-                    <a:blip r:embed="rId38"/>
+                    <a:blip r:embed="rId40"/>
                     <a:stretch>
                       <a:fillRect/>
                     </a:stretch>
@@ -11926,7 +11924,7 @@
                     <pic:cNvPicPr/>
                   </pic:nvPicPr>
                   <pic:blipFill>
-                    <a:blip r:embed="rId39"/>
+                    <a:blip r:embed="rId41"/>
                     <a:stretch>
                       <a:fillRect/>
                     </a:stretch>
@@ -12523,7 +12521,7 @@
                     <pic:cNvPicPr/>
                   </pic:nvPicPr>
                   <pic:blipFill>
-                    <a:blip r:embed="rId40"/>
+                    <a:blip r:embed="rId42"/>
                     <a:stretch>
                       <a:fillRect/>
                     </a:stretch>
@@ -12663,6 +12661,7 @@
         <w:rPr>
           <w:b/>
           <w:bCs/>
+          <w:noProof/>
         </w:rPr>
         <w:drawing>
           <wp:inline distT="0" distB="0" distL="0" distR="0" wp14:anchorId="46627635" wp14:editId="4A5DB7C7">
@@ -12680,7 +12679,7 @@
                     <pic:cNvPicPr/>
                   </pic:nvPicPr>
                   <pic:blipFill>
-                    <a:blip r:embed="rId32"/>
+                    <a:blip r:embed="rId34"/>
                     <a:stretch>
                       <a:fillRect/>
                     </a:stretch>
@@ -12851,6 +12850,10 @@
         <w:jc w:val="center"/>
       </w:pPr>
       <w:r>
+        <w:rPr>
+          <w:noProof/>
+        </w:rPr>
+        <w:lastRenderedPageBreak/>
         <w:drawing>
           <wp:inline distT="0" distB="0" distL="0" distR="0" wp14:anchorId="7E00AE1A" wp14:editId="7B242310">
             <wp:extent cx="3371850" cy="1295400"/>
@@ -12867,7 +12870,7 @@
                     <pic:cNvPicPr/>
                   </pic:nvPicPr>
                   <pic:blipFill>
-                    <a:blip r:embed="rId35"/>
+                    <a:blip r:embed="rId37"/>
                     <a:stretch>
                       <a:fillRect/>
                     </a:stretch>
@@ -13076,6 +13079,9 @@
         <w:jc w:val="center"/>
       </w:pPr>
       <w:r>
+        <w:rPr>
+          <w:noProof/>
+        </w:rPr>
         <w:drawing>
           <wp:inline distT="0" distB="0" distL="0" distR="0" wp14:anchorId="3F79A427" wp14:editId="389B3F44">
             <wp:extent cx="5124450" cy="1295400"/>
@@ -13092,7 +13098,7 @@
                     <pic:cNvPicPr/>
                   </pic:nvPicPr>
                   <pic:blipFill>
-                    <a:blip r:embed="rId41"/>
+                    <a:blip r:embed="rId43"/>
                     <a:stretch>
                       <a:fillRect/>
                     </a:stretch>
@@ -13208,6 +13214,9 @@
         <w:jc w:val="center"/>
       </w:pPr>
       <w:r>
+        <w:rPr>
+          <w:noProof/>
+        </w:rPr>
         <w:drawing>
           <wp:inline distT="0" distB="0" distL="0" distR="0" wp14:anchorId="75FE32A9" wp14:editId="1DA2694E">
             <wp:extent cx="5731510" cy="2590165"/>
@@ -13224,7 +13233,7 @@
                     <pic:cNvPicPr/>
                   </pic:nvPicPr>
                   <pic:blipFill>
-                    <a:blip r:embed="rId42"/>
+                    <a:blip r:embed="rId44"/>
                     <a:stretch>
                       <a:fillRect/>
                     </a:stretch>
@@ -13256,6 +13265,7 @@
       </w:pPr>
       <w:bookmarkStart w:id="45" w:name="_Toc235624427"/>
       <w:r>
+        <w:lastRenderedPageBreak/>
         <w:t>Corresponding CSS:</w:t>
       </w:r>
       <w:bookmarkEnd w:id="45"/>
@@ -13265,6 +13275,9 @@
         <w:jc w:val="center"/>
       </w:pPr>
       <w:r>
+        <w:rPr>
+          <w:noProof/>
+        </w:rPr>
         <w:drawing>
           <wp:inline distT="0" distB="0" distL="0" distR="0" wp14:anchorId="3EF6E991" wp14:editId="0A390679">
             <wp:extent cx="5731510" cy="2919730"/>
@@ -13281,7 +13294,7 @@
                     <pic:cNvPicPr/>
                   </pic:nvPicPr>
                   <pic:blipFill>
-                    <a:blip r:embed="rId43"/>
+                    <a:blip r:embed="rId45"/>
                     <a:stretch>
                       <a:fillRect/>
                     </a:stretch>
@@ -13402,14 +13415,7 @@
           <w:b/>
           <w:bCs/>
         </w:rPr>
-        <w:t>Why this is bad</w:t>
-      </w:r>
-      <w:r>
-        <w:rPr>
-          <w:b/>
-          <w:bCs/>
-        </w:rPr>
-        <w:t>:</w:t>
+        <w:t>Why this is bad:</w:t>
       </w:r>
     </w:p>
     <w:p>
@@ -13452,7 +13458,6 @@
         </w:numPr>
       </w:pPr>
       <w:r>
-        <w:lastRenderedPageBreak/>
         <w:t xml:space="preserve">Writing all UI directly inside </w:t>
       </w:r>
       <w:r>
@@ -13465,13 +13470,7 @@
         <w:t>App.jsx</w:t>
       </w:r>
       <w:r>
-        <w:t xml:space="preserve"> makes the code messy, hard to maintain, and defeats the purpose of </w:t>
-      </w:r>
-      <w:r>
-        <w:t>Reacts</w:t>
-      </w:r>
-      <w:r>
-        <w:t xml:space="preserve"> efficiency.</w:t>
+        <w:t xml:space="preserve"> makes the code messy, hard to maintain, and defeats the purpose of Reacts efficiency.</w:t>
       </w:r>
     </w:p>
     <w:p>
@@ -13480,6 +13479,7 @@
       </w:pPr>
       <w:bookmarkStart w:id="47" w:name="_Toc235624429"/>
       <w:r>
+        <w:lastRenderedPageBreak/>
         <w:t>Solution → Component-Based Architecture</w:t>
       </w:r>
       <w:bookmarkEnd w:id="47"/>
@@ -13882,6 +13882,9 @@
         <w:jc w:val="center"/>
       </w:pPr>
       <w:r>
+        <w:rPr>
+          <w:noProof/>
+        </w:rPr>
         <w:drawing>
           <wp:inline distT="0" distB="0" distL="0" distR="0" wp14:anchorId="635FBDBD" wp14:editId="688BC8AC">
             <wp:extent cx="5731510" cy="1443990"/>
@@ -13898,7 +13901,7 @@
                     <pic:cNvPicPr/>
                   </pic:nvPicPr>
                   <pic:blipFill>
-                    <a:blip r:embed="rId44"/>
+                    <a:blip r:embed="rId46"/>
                     <a:stretch>
                       <a:fillRect/>
                     </a:stretch>
@@ -14070,6 +14073,10 @@
         <w:jc w:val="center"/>
       </w:pPr>
       <w:r>
+        <w:rPr>
+          <w:noProof/>
+        </w:rPr>
+        <w:lastRenderedPageBreak/>
         <w:drawing>
           <wp:inline distT="0" distB="0" distL="0" distR="0" wp14:anchorId="5DA0D325" wp14:editId="70D6C0A0">
             <wp:extent cx="5731510" cy="1780540"/>
@@ -14086,7 +14093,7 @@
                     <pic:cNvPicPr/>
                   </pic:nvPicPr>
                   <pic:blipFill>
-                    <a:blip r:embed="rId45"/>
+                    <a:blip r:embed="rId47"/>
                     <a:stretch>
                       <a:fillRect/>
                     </a:stretch>
@@ -14185,6 +14192,9 @@
         <w:jc w:val="center"/>
       </w:pPr>
       <w:r>
+        <w:rPr>
+          <w:noProof/>
+        </w:rPr>
         <w:drawing>
           <wp:inline distT="0" distB="0" distL="0" distR="0" wp14:anchorId="2FDB7B5B" wp14:editId="4CDA073B">
             <wp:extent cx="5731510" cy="2756535"/>
@@ -14201,7 +14211,7 @@
                     <pic:cNvPicPr/>
                   </pic:nvPicPr>
                   <pic:blipFill>
-                    <a:blip r:embed="rId46"/>
+                    <a:blip r:embed="rId48"/>
                     <a:stretch>
                       <a:fillRect/>
                     </a:stretch>
@@ -14229,12 +14239,16 @@
       </w:pPr>
       <w:bookmarkStart w:id="60" w:name="_Toc235624442"/>
       <w:r>
+        <w:lastRenderedPageBreak/>
         <w:t>Output:</w:t>
       </w:r>
       <w:bookmarkEnd w:id="60"/>
     </w:p>
     <w:p>
       <w:r>
+        <w:rPr>
+          <w:noProof/>
+        </w:rPr>
         <w:drawing>
           <wp:inline distT="0" distB="0" distL="0" distR="0" wp14:anchorId="71F40A0D" wp14:editId="3A32820B">
             <wp:extent cx="5448300" cy="1657350"/>
@@ -14251,7 +14265,7 @@
                     <pic:cNvPicPr/>
                   </pic:nvPicPr>
                   <pic:blipFill>
-                    <a:blip r:embed="rId47"/>
+                    <a:blip r:embed="rId49"/>
                     <a:stretch>
                       <a:fillRect/>
                     </a:stretch>
@@ -14452,6 +14466,9 @@
         <w:jc w:val="center"/>
       </w:pPr>
       <w:r>
+        <w:rPr>
+          <w:noProof/>
+        </w:rPr>
         <w:drawing>
           <wp:inline distT="0" distB="0" distL="0" distR="0" wp14:anchorId="29F0F2D6" wp14:editId="5D60F3EC">
             <wp:extent cx="5731510" cy="2737485"/>
@@ -14468,7 +14485,7 @@
                     <pic:cNvPicPr/>
                   </pic:nvPicPr>
                   <pic:blipFill>
-                    <a:blip r:embed="rId48"/>
+                    <a:blip r:embed="rId50"/>
                     <a:stretch>
                       <a:fillRect/>
                     </a:stretch>
@@ -14494,6 +14511,10 @@
         <w:jc w:val="center"/>
       </w:pPr>
       <w:r>
+        <w:rPr>
+          <w:noProof/>
+        </w:rPr>
+        <w:lastRenderedPageBreak/>
         <w:drawing>
           <wp:inline distT="0" distB="0" distL="0" distR="0" wp14:anchorId="15DC8D77" wp14:editId="5C49D50B">
             <wp:extent cx="5731510" cy="2756535"/>
@@ -14510,7 +14531,7 @@
                     <pic:cNvPicPr/>
                   </pic:nvPicPr>
                   <pic:blipFill>
-                    <a:blip r:embed="rId49"/>
+                    <a:blip r:embed="rId51"/>
                     <a:stretch>
                       <a:fillRect/>
                     </a:stretch>
@@ -14676,7 +14697,6 @@
       </w:pPr>
       <w:bookmarkStart w:id="66" w:name="_Toc235624448"/>
       <w:r>
-        <w:lastRenderedPageBreak/>
         <w:t>Creating Another Component – Navbar Example</w:t>
       </w:r>
       <w:bookmarkEnd w:id="66"/>
@@ -14777,6 +14797,7 @@
       </w:pPr>
       <w:bookmarkStart w:id="68" w:name="_Toc235624450"/>
       <w:r>
+        <w:lastRenderedPageBreak/>
         <w:t>Step 2: Write the Component</w:t>
       </w:r>
       <w:bookmarkEnd w:id="68"/>
@@ -14786,6 +14807,9 @@
         <w:jc w:val="center"/>
       </w:pPr>
       <w:r>
+        <w:rPr>
+          <w:noProof/>
+        </w:rPr>
         <w:drawing>
           <wp:inline distT="0" distB="0" distL="0" distR="0" wp14:anchorId="0197A7B1" wp14:editId="26143203">
             <wp:extent cx="5731510" cy="2091055"/>
@@ -14802,7 +14826,7 @@
                     <pic:cNvPicPr/>
                   </pic:nvPicPr>
                   <pic:blipFill>
-                    <a:blip r:embed="rId50"/>
+                    <a:blip r:embed="rId52"/>
                     <a:stretch>
                       <a:fillRect/>
                     </a:stretch>
@@ -14828,6 +14852,9 @@
         <w:jc w:val="center"/>
       </w:pPr>
       <w:r>
+        <w:rPr>
+          <w:noProof/>
+        </w:rPr>
         <w:drawing>
           <wp:inline distT="0" distB="0" distL="0" distR="0" wp14:anchorId="025E281F" wp14:editId="68D89856">
             <wp:extent cx="5731510" cy="1612265"/>
@@ -14844,7 +14871,7 @@
                     <pic:cNvPicPr/>
                   </pic:nvPicPr>
                   <pic:blipFill>
-                    <a:blip r:embed="rId51"/>
+                    <a:blip r:embed="rId53"/>
                     <a:stretch>
                       <a:fillRect/>
                     </a:stretch>
@@ -14891,6 +14918,9 @@
         <w:jc w:val="center"/>
       </w:pPr>
       <w:r>
+        <w:rPr>
+          <w:noProof/>
+        </w:rPr>
         <w:drawing>
           <wp:inline distT="0" distB="0" distL="0" distR="0" wp14:anchorId="15B6BEC5" wp14:editId="2931BF02">
             <wp:extent cx="5731510" cy="2756535"/>
@@ -14907,7 +14937,7 @@
                     <pic:cNvPicPr/>
                   </pic:nvPicPr>
                   <pic:blipFill>
-                    <a:blip r:embed="rId52"/>
+                    <a:blip r:embed="rId54"/>
                     <a:stretch>
                       <a:fillRect/>
                     </a:stretch>
@@ -15168,6 +15198,9 @@
         <w:jc w:val="center"/>
       </w:pPr>
       <w:r>
+        <w:rPr>
+          <w:noProof/>
+        </w:rPr>
         <w:drawing>
           <wp:inline distT="0" distB="0" distL="0" distR="0" wp14:anchorId="54B09B3C" wp14:editId="57A98733">
             <wp:extent cx="5731510" cy="3083560"/>
@@ -15184,7 +15217,7 @@
                     <pic:cNvPicPr/>
                   </pic:nvPicPr>
                   <pic:blipFill>
-                    <a:blip r:embed="rId53"/>
+                    <a:blip r:embed="rId55"/>
                     <a:stretch>
                       <a:fillRect/>
                     </a:stretch>
@@ -15692,6 +15725,9 @@
         <w:jc w:val="center"/>
       </w:pPr>
       <w:r>
+        <w:rPr>
+          <w:noProof/>
+        </w:rPr>
         <w:drawing>
           <wp:inline distT="0" distB="0" distL="0" distR="0" wp14:anchorId="1435B2E4" wp14:editId="6B1C7FE9">
             <wp:extent cx="3371850" cy="1295400"/>
@@ -15708,7 +15744,7 @@
                     <pic:cNvPicPr/>
                   </pic:nvPicPr>
                   <pic:blipFill>
-                    <a:blip r:embed="rId35"/>
+                    <a:blip r:embed="rId37"/>
                     <a:stretch>
                       <a:fillRect/>
                     </a:stretch>
@@ -15750,7 +15786,10 @@
         <w:t>src/</w:t>
       </w:r>
       <w:r>
-        <w:t xml:space="preserve"> before starting fresh.</w:t>
+        <w:t xml:space="preserve"> before starting fresh</w:t>
+      </w:r>
+      <w:r>
+        <w:t>.</w:t>
       </w:r>
     </w:p>
     <w:p>
@@ -15786,14 +15825,203 @@
         <w:t xml:space="preserve"> was built directly with HTML/CSS structure to have something to work with.</w:t>
       </w:r>
     </w:p>
+    <w:p>
+      <w:pPr>
+        <w:jc w:val="center"/>
+      </w:pPr>
+      <w:r>
+        <w:drawing>
+          <wp:inline distT="0" distB="0" distL="0" distR="0" wp14:anchorId="32541552" wp14:editId="5579A1C6">
+            <wp:extent cx="8863330" cy="2329180"/>
+            <wp:effectExtent l="0" t="0" r="3175" b="4445"/>
+            <wp:docPr id="1887916181" name="Picture 1"/>
+            <wp:cNvGraphicFramePr>
+              <a:graphicFrameLocks xmlns:a="http://schemas.openxmlformats.org/drawingml/2006/main" noChangeAspect="1"/>
+            </wp:cNvGraphicFramePr>
+            <a:graphic xmlns:a="http://schemas.openxmlformats.org/drawingml/2006/main">
+              <a:graphicData uri="http://schemas.openxmlformats.org/drawingml/2006/picture">
+                <pic:pic xmlns:pic="http://schemas.openxmlformats.org/drawingml/2006/picture">
+                  <pic:nvPicPr>
+                    <pic:cNvPr id="1887916181" name=""/>
+                    <pic:cNvPicPr/>
+                  </pic:nvPicPr>
+                  <pic:blipFill>
+                    <a:blip r:embed="rId56"/>
+                    <a:stretch>
+                      <a:fillRect/>
+                    </a:stretch>
+                  </pic:blipFill>
+                  <pic:spPr>
+                    <a:xfrm>
+                      <a:off x="0" y="0"/>
+                      <a:ext cx="8863330" cy="2329180"/>
+                    </a:xfrm>
+                    <a:prstGeom prst="rect">
+                      <a:avLst/>
+                    </a:prstGeom>
+                  </pic:spPr>
+                </pic:pic>
+              </a:graphicData>
+            </a:graphic>
+          </wp:inline>
+        </w:drawing>
+      </w:r>
+    </w:p>
+    <w:p>
+      <w:pPr>
+        <w:jc w:val="center"/>
+      </w:pPr>
+      <w:r>
+        <w:lastRenderedPageBreak/>
+        <w:drawing>
+          <wp:inline distT="0" distB="0" distL="0" distR="0" wp14:anchorId="61C1730D" wp14:editId="5567B487">
+            <wp:extent cx="5902960" cy="5731510"/>
+            <wp:effectExtent l="0" t="0" r="2540" b="2540"/>
+            <wp:docPr id="1471827632" name="Picture 1"/>
+            <wp:cNvGraphicFramePr>
+              <a:graphicFrameLocks xmlns:a="http://schemas.openxmlformats.org/drawingml/2006/main" noChangeAspect="1"/>
+            </wp:cNvGraphicFramePr>
+            <a:graphic xmlns:a="http://schemas.openxmlformats.org/drawingml/2006/main">
+              <a:graphicData uri="http://schemas.openxmlformats.org/drawingml/2006/picture">
+                <pic:pic xmlns:pic="http://schemas.openxmlformats.org/drawingml/2006/picture">
+                  <pic:nvPicPr>
+                    <pic:cNvPr id="1471827632" name=""/>
+                    <pic:cNvPicPr/>
+                  </pic:nvPicPr>
+                  <pic:blipFill>
+                    <a:blip r:embed="rId57"/>
+                    <a:stretch>
+                      <a:fillRect/>
+                    </a:stretch>
+                  </pic:blipFill>
+                  <pic:spPr>
+                    <a:xfrm>
+                      <a:off x="0" y="0"/>
+                      <a:ext cx="5902960" cy="5731510"/>
+                    </a:xfrm>
+                    <a:prstGeom prst="rect">
+                      <a:avLst/>
+                    </a:prstGeom>
+                  </pic:spPr>
+                </pic:pic>
+              </a:graphicData>
+            </a:graphic>
+          </wp:inline>
+        </w:drawing>
+      </w:r>
+    </w:p>
     <w:sectPr>
-      <w:pgSz w:w="11906" w:h="16838"/>
+      <w:footerReference w:type="default" r:id="rId58"/>
+      <w:pgSz w:w="16838" w:h="11906" w:orient="landscape"/>
       <w:pgMar w:top="1440" w:right="1440" w:bottom="1440" w:left="1440" w:header="708" w:footer="708" w:gutter="0"/>
       <w:cols w:space="708"/>
       <w:docGrid w:linePitch="360"/>
     </w:sectPr>
   </w:body>
 </w:document>
+</file>
+
+<file path=word/endnotes.xml><?xml version="1.0" encoding="utf-8"?>
+<w:endnotes xmlns:wpc="http://schemas.microsoft.com/office/word/2010/wordprocessingCanvas" xmlns:cx="http://schemas.microsoft.com/office/drawing/2014/chartex" xmlns:cx1="http://schemas.microsoft.com/office/drawing/2015/9/8/chartex" xmlns:cx2="http://schemas.microsoft.com/office/drawing/2015/10/21/chartex" xmlns:cx3="http://schemas.microsoft.com/office/drawing/2016/5/9/chartex" xmlns:cx4="http://schemas.microsoft.com/office/drawing/2016/5/10/chartex" xmlns:cx5="http://schemas.microsoft.com/office/drawing/2016/5/11/chartex" xmlns:cx6="http://schemas.microsoft.com/office/drawing/2016/5/12/chartex" xmlns:cx7="http://schemas.microsoft.com/office/drawing/2016/5/13/chartex" xmlns:cx8="http://schemas.microsoft.com/office/drawing/2016/5/14/chartex" xmlns:mc="http://schemas.openxmlformats.org/markup-compatibility/2006" xmlns:aink="http://schemas.microsoft.com/office/drawing/2016/ink" xmlns:am3d="http://schemas.microsoft.com/office/drawing/2017/model3d" xmlns:o="urn:schemas-microsoft-com:office:office" xmlns:oel="http://schemas.microsoft.com/office/2019/extlst" xmlns:r="http://schemas.openxmlformats.org/officeDocument/2006/relationships" xmlns:m="http://schemas.openxmlformats.org/officeDocument/2006/math" xmlns:v="urn:schemas-microsoft-com:vml" xmlns:wp14="http://schemas.microsoft.com/office/word/2010/wordprocessingDrawing" xmlns:wp="http://schemas.openxmlformats.org/drawingml/2006/wordprocessingDrawing" xmlns:w10="urn:schemas-microsoft-com:office:word" xmlns:w="http://schemas.openxmlformats.org/wordprocessingml/2006/main" xmlns:w14="http://schemas.microsoft.com/office/word/2010/wordml" xmlns:w15="http://schemas.microsoft.com/office/word/2012/wordml" xmlns:w16cex="http://schemas.microsoft.com/office/word/2018/wordml/cex" xmlns:w16cid="http://schemas.microsoft.com/office/word/2016/wordml/cid" xmlns:w16="http://schemas.microsoft.com/office/word/2018/wordml" xmlns:w16du="http://schemas.microsoft.com/office/word/2023/wordml/word16du" xmlns:w16sdtdh="http://schemas.microsoft.com/office/word/2020/wordml/sdtdatahash" xmlns:w16sdtfl="http://schemas.microsoft.com/office/word/2024/wordml/sdtformatlock" xmlns:w16se="http://schemas.microsoft.com/office/word/2015/wordml/symex" xmlns:wpg="http://schemas.microsoft.com/office/word/2010/wordprocessingGroup" xmlns:wpi="http://schemas.microsoft.com/office/word/2010/wordprocessingInk" xmlns:wne="http://schemas.microsoft.com/office/word/2006/wordml" xmlns:wps="http://schemas.microsoft.com/office/word/2010/wordprocessingShape" mc:Ignorable="w14 w15 w16se w16cid w16 w16cex w16sdtdh w16sdtfl w16du wp14">
+  <w:endnote w:type="separator" w:id="-1">
+    <w:p>
+      <w:pPr>
+        <w:spacing w:after="0" w:line="240" w:lineRule="auto"/>
+      </w:pPr>
+      <w:r>
+        <w:separator/>
+      </w:r>
+    </w:p>
+  </w:endnote>
+  <w:endnote w:type="continuationSeparator" w:id="0">
+    <w:p>
+      <w:pPr>
+        <w:spacing w:after="0" w:line="240" w:lineRule="auto"/>
+      </w:pPr>
+      <w:r>
+        <w:continuationSeparator/>
+      </w:r>
+    </w:p>
+  </w:endnote>
+</w:endnotes>
+</file>
+
+<file path=word/footer1.xml><?xml version="1.0" encoding="utf-8"?>
+<w:ftr xmlns:wpc="http://schemas.microsoft.com/office/word/2010/wordprocessingCanvas" xmlns:cx="http://schemas.microsoft.com/office/drawing/2014/chartex" xmlns:cx1="http://schemas.microsoft.com/office/drawing/2015/9/8/chartex" xmlns:cx2="http://schemas.microsoft.com/office/drawing/2015/10/21/chartex" xmlns:cx3="http://schemas.microsoft.com/office/drawing/2016/5/9/chartex" xmlns:cx4="http://schemas.microsoft.com/office/drawing/2016/5/10/chartex" xmlns:cx5="http://schemas.microsoft.com/office/drawing/2016/5/11/chartex" xmlns:cx6="http://schemas.microsoft.com/office/drawing/2016/5/12/chartex" xmlns:cx7="http://schemas.microsoft.com/office/drawing/2016/5/13/chartex" xmlns:cx8="http://schemas.microsoft.com/office/drawing/2016/5/14/chartex" xmlns:mc="http://schemas.openxmlformats.org/markup-compatibility/2006" xmlns:aink="http://schemas.microsoft.com/office/drawing/2016/ink" xmlns:am3d="http://schemas.microsoft.com/office/drawing/2017/model3d" xmlns:o="urn:schemas-microsoft-com:office:office" xmlns:oel="http://schemas.microsoft.com/office/2019/extlst" xmlns:r="http://schemas.openxmlformats.org/officeDocument/2006/relationships" xmlns:m="http://schemas.openxmlformats.org/officeDocument/2006/math" xmlns:v="urn:schemas-microsoft-com:vml" xmlns:wp14="http://schemas.microsoft.com/office/word/2010/wordprocessingDrawing" xmlns:wp="http://schemas.openxmlformats.org/drawingml/2006/wordprocessingDrawing" xmlns:w10="urn:schemas-microsoft-com:office:word" xmlns:w="http://schemas.openxmlformats.org/wordprocessingml/2006/main" xmlns:w14="http://schemas.microsoft.com/office/word/2010/wordml" xmlns:w15="http://schemas.microsoft.com/office/word/2012/wordml" xmlns:w16cex="http://schemas.microsoft.com/office/word/2018/wordml/cex" xmlns:w16cid="http://schemas.microsoft.com/office/word/2016/wordml/cid" xmlns:w16="http://schemas.microsoft.com/office/word/2018/wordml" xmlns:w16du="http://schemas.microsoft.com/office/word/2023/wordml/word16du" xmlns:w16sdtdh="http://schemas.microsoft.com/office/word/2020/wordml/sdtdatahash" xmlns:w16sdtfl="http://schemas.microsoft.com/office/word/2024/wordml/sdtformatlock" xmlns:w16se="http://schemas.microsoft.com/office/word/2015/wordml/symex" xmlns:wpg="http://schemas.microsoft.com/office/word/2010/wordprocessingGroup" xmlns:wpi="http://schemas.microsoft.com/office/word/2010/wordprocessingInk" xmlns:wne="http://schemas.microsoft.com/office/word/2006/wordml" xmlns:wps="http://schemas.microsoft.com/office/word/2010/wordprocessingShape" mc:Ignorable="w14 w15 w16se w16cid w16 w16cex w16sdtdh w16sdtfl w16du wp14">
+  <w:sdt>
+    <w:sdtPr>
+      <w:id w:val="1231730991"/>
+      <w:docPartObj>
+        <w:docPartGallery w:val="Page Numbers (Bottom of Page)"/>
+        <w:docPartUnique/>
+      </w:docPartObj>
+    </w:sdtPr>
+    <w:sdtEndPr>
+      <w:rPr>
+        <w:noProof/>
+      </w:rPr>
+    </w:sdtEndPr>
+    <w:sdtContent>
+      <w:p>
+        <w:pPr>
+          <w:pStyle w:val="Footer"/>
+          <w:jc w:val="right"/>
+        </w:pPr>
+        <w:r>
+          <w:fldChar w:fldCharType="begin"/>
+        </w:r>
+        <w:r>
+          <w:instrText xml:space="preserve"> PAGE   \* MERGEFORMAT </w:instrText>
+        </w:r>
+        <w:r>
+          <w:fldChar w:fldCharType="separate"/>
+        </w:r>
+        <w:r>
+          <w:rPr>
+            <w:noProof/>
+          </w:rPr>
+          <w:t>2</w:t>
+        </w:r>
+        <w:r>
+          <w:rPr>
+            <w:noProof/>
+          </w:rPr>
+          <w:fldChar w:fldCharType="end"/>
+        </w:r>
+      </w:p>
+    </w:sdtContent>
+  </w:sdt>
+  <w:p>
+    <w:pPr>
+      <w:pStyle w:val="Footer"/>
+    </w:pPr>
+  </w:p>
+</w:ftr>
+</file>
+
+<file path=word/footnotes.xml><?xml version="1.0" encoding="utf-8"?>
+<w:footnotes xmlns:wpc="http://schemas.microsoft.com/office/word/2010/wordprocessingCanvas" xmlns:cx="http://schemas.microsoft.com/office/drawing/2014/chartex" xmlns:cx1="http://schemas.microsoft.com/office/drawing/2015/9/8/chartex" xmlns:cx2="http://schemas.microsoft.com/office/drawing/2015/10/21/chartex" xmlns:cx3="http://schemas.microsoft.com/office/drawing/2016/5/9/chartex" xmlns:cx4="http://schemas.microsoft.com/office/drawing/2016/5/10/chartex" xmlns:cx5="http://schemas.microsoft.com/office/drawing/2016/5/11/chartex" xmlns:cx6="http://schemas.microsoft.com/office/drawing/2016/5/12/chartex" xmlns:cx7="http://schemas.microsoft.com/office/drawing/2016/5/13/chartex" xmlns:cx8="http://schemas.microsoft.com/office/drawing/2016/5/14/chartex" xmlns:mc="http://schemas.openxmlformats.org/markup-compatibility/2006" xmlns:aink="http://schemas.microsoft.com/office/drawing/2016/ink" xmlns:am3d="http://schemas.microsoft.com/office/drawing/2017/model3d" xmlns:o="urn:schemas-microsoft-com:office:office" xmlns:oel="http://schemas.microsoft.com/office/2019/extlst" xmlns:r="http://schemas.openxmlformats.org/officeDocument/2006/relationships" xmlns:m="http://schemas.openxmlformats.org/officeDocument/2006/math" xmlns:v="urn:schemas-microsoft-com:vml" xmlns:wp14="http://schemas.microsoft.com/office/word/2010/wordprocessingDrawing" xmlns:wp="http://schemas.openxmlformats.org/drawingml/2006/wordprocessingDrawing" xmlns:w10="urn:schemas-microsoft-com:office:word" xmlns:w="http://schemas.openxmlformats.org/wordprocessingml/2006/main" xmlns:w14="http://schemas.microsoft.com/office/word/2010/wordml" xmlns:w15="http://schemas.microsoft.com/office/word/2012/wordml" xmlns:w16cex="http://schemas.microsoft.com/office/word/2018/wordml/cex" xmlns:w16cid="http://schemas.microsoft.com/office/word/2016/wordml/cid" xmlns:w16="http://schemas.microsoft.com/office/word/2018/wordml" xmlns:w16du="http://schemas.microsoft.com/office/word/2023/wordml/word16du" xmlns:w16sdtdh="http://schemas.microsoft.com/office/word/2020/wordml/sdtdatahash" xmlns:w16sdtfl="http://schemas.microsoft.com/office/word/2024/wordml/sdtformatlock" xmlns:w16se="http://schemas.microsoft.com/office/word/2015/wordml/symex" xmlns:wpg="http://schemas.microsoft.com/office/word/2010/wordprocessingGroup" xmlns:wpi="http://schemas.microsoft.com/office/word/2010/wordprocessingInk" xmlns:wne="http://schemas.microsoft.com/office/word/2006/wordml" xmlns:wps="http://schemas.microsoft.com/office/word/2010/wordprocessingShape" mc:Ignorable="w14 w15 w16se w16cid w16 w16cex w16sdtdh w16sdtfl w16du wp14">
+  <w:footnote w:type="separator" w:id="-1">
+    <w:p>
+      <w:pPr>
+        <w:spacing w:after="0" w:line="240" w:lineRule="auto"/>
+      </w:pPr>
+      <w:r>
+        <w:separator/>
+      </w:r>
+    </w:p>
+  </w:footnote>
+  <w:footnote w:type="continuationSeparator" w:id="0">
+    <w:p>
+      <w:pPr>
+        <w:spacing w:after="0" w:line="240" w:lineRule="auto"/>
+      </w:pPr>
+      <w:r>
+        <w:continuationSeparator/>
+      </w:r>
+    </w:p>
+  </w:footnote>
+</w:footnotes>
 </file>
 
 <file path=word/numbering.xml><?xml version="1.0" encoding="utf-8"?>
@@ -21690,6 +21918,7 @@
   <w:style w:type="character" w:default="1" w:styleId="DefaultParagraphFont">
     <w:name w:val="Default Paragraph Font"/>
     <w:uiPriority w:val="1"/>
+    <w:semiHidden/>
     <w:unhideWhenUsed/>
   </w:style>
   <w:style w:type="table" w:default="1" w:styleId="TableNormal">
@@ -22165,6 +22394,50 @@
       <w:ind w:left="480"/>
     </w:pPr>
   </w:style>
+  <w:style w:type="paragraph" w:styleId="Header">
+    <w:name w:val="header"/>
+    <w:basedOn w:val="Normal"/>
+    <w:link w:val="HeaderChar"/>
+    <w:uiPriority w:val="99"/>
+    <w:unhideWhenUsed/>
+    <w:rsid w:val="002D4655"/>
+    <w:pPr>
+      <w:tabs>
+        <w:tab w:val="center" w:pos="4513"/>
+        <w:tab w:val="right" w:pos="9026"/>
+      </w:tabs>
+      <w:spacing w:after="0" w:line="240" w:lineRule="auto"/>
+    </w:pPr>
+  </w:style>
+  <w:style w:type="character" w:customStyle="1" w:styleId="HeaderChar">
+    <w:name w:val="Header Char"/>
+    <w:basedOn w:val="DefaultParagraphFont"/>
+    <w:link w:val="Header"/>
+    <w:uiPriority w:val="99"/>
+    <w:rsid w:val="002D4655"/>
+  </w:style>
+  <w:style w:type="paragraph" w:styleId="Footer">
+    <w:name w:val="footer"/>
+    <w:basedOn w:val="Normal"/>
+    <w:link w:val="FooterChar"/>
+    <w:uiPriority w:val="99"/>
+    <w:unhideWhenUsed/>
+    <w:rsid w:val="002D4655"/>
+    <w:pPr>
+      <w:tabs>
+        <w:tab w:val="center" w:pos="4513"/>
+        <w:tab w:val="right" w:pos="9026"/>
+      </w:tabs>
+      <w:spacing w:after="0" w:line="240" w:lineRule="auto"/>
+    </w:pPr>
+  </w:style>
+  <w:style w:type="character" w:customStyle="1" w:styleId="FooterChar">
+    <w:name w:val="Footer Char"/>
+    <w:basedOn w:val="DefaultParagraphFont"/>
+    <w:link w:val="Footer"/>
+    <w:uiPriority w:val="99"/>
+    <w:rsid w:val="002D4655"/>
+  </w:style>
 </w:styles>
 </file>
 

</xml_diff>